<commit_message>
Data guide: TSE only, later listings included, database firm code, general industry code
Co-Authored-By: Claude Opus 5.5 <noreply@anthropic.com>
Claude-Session: https://claude.ai/code/session_019etBaQcYpfE848z3Ex8rct
</commit_message>
<xml_diff>
--- a/docs/Data_Collection_Guide.docx
+++ b/docs/Data_Collection_Guide.docx
@@ -491,7 +491,7 @@
                 <w:szCs w:val="21"/>
                 <w:rtl/>
               </w:rPr>
-              <w:t xml:space="preserve">پذیرفته بوده‌اند. شرکت‌هایی را که بعداً از بورس خارج شده‌اند</w:t>
+              <w:t xml:space="preserve">بوده‌اند. شرکت‌هایی که</w:t>
             </w:r>
             <w:r>
               <w:rPr>
@@ -511,7 +511,36 @@
                 <w:szCs w:val="21"/>
                 <w:rtl/>
               </w:rPr>
-              <w:t xml:space="preserve">حذف نکنید</w:t>
+              <w:t xml:space="preserve">بعد از ۱۳۸۰ پذیرفته شده‌اند هم بیایند</w:t>
+            </w:r>
+            <w:r>
+              <w:rPr>
+                <w:rFonts w:ascii="Tahoma" w:hAnsi="Tahoma" w:cs="Tahoma"/>
+                <w:sz w:val="21"/>
+                <w:szCs w:val="21"/>
+                <w:rtl/>
+              </w:rPr>
+              <w:t xml:space="preserve">، از اولین سالی که داده دارند. شرکت‌هایی که بعداً از بورس خارج شده‌اند هم</w:t>
+            </w:r>
+            <w:r>
+              <w:rPr>
+                <w:rFonts w:ascii="Tahoma" w:hAnsi="Tahoma" w:cs="Tahoma"/>
+                <w:sz w:val="21"/>
+                <w:szCs w:val="21"/>
+                <w:rtl/>
+              </w:rPr>
+              <w:t xml:space="preserve"> </w:t>
+            </w:r>
+            <w:r>
+              <w:rPr>
+                <w:rFonts w:ascii="Tahoma" w:hAnsi="Tahoma" w:cs="Tahoma"/>
+                <w:b/>
+                <w:bCs/>
+                <w:sz w:val="21"/>
+                <w:szCs w:val="21"/>
+                <w:rtl/>
+              </w:rPr>
+              <w:t xml:space="preserve">حذف نشوند</w:t>
             </w:r>
             <w:r>
               <w:rPr>
@@ -538,7 +567,7 @@
                 <w:szCs w:val="21"/>
                 <w:rtl/>
               </w:rPr>
-              <w:t xml:space="preserve">جلوگیری از سوگیری بقا</w:t>
+              <w:t xml:space="preserve">پنل نامتوازن؛ جلوگیری از سوگیری بقا</w:t>
             </w:r>
           </w:p>
         </w:tc>
@@ -558,43 +587,81 @@
                 <w:szCs w:val="21"/>
                 <w:rtl/>
               </w:rPr>
-              <w:t xml:space="preserve">۲</w:t>
-            </w:r>
-          </w:p>
-        </w:tc>
-        <w:tc>
-          <w:tcPr/>
-          <w:p>
-            <w:pPr>
-              <w:pStyle w:val="Compact"/>
-              <w:bidi/>
-            </w:pPr>
-            <w:r>
-              <w:rPr>
-                <w:rFonts w:ascii="Tahoma" w:hAnsi="Tahoma" w:cs="Tahoma"/>
-                <w:sz w:val="21"/>
-                <w:szCs w:val="21"/>
-                <w:rtl/>
-              </w:rPr>
-              <w:t xml:space="preserve">حذف بانک‌ها، مؤسسات اعتباری، بیمه‌ها، لیزینگ‌ها، شرکت‌های سرمایه‌گذاری، هلدینگ‌ها، کارگزاری‌ها و صندوق‌ها</w:t>
-            </w:r>
-          </w:p>
-        </w:tc>
-        <w:tc>
-          <w:tcPr/>
-          <w:p>
-            <w:pPr>
-              <w:pStyle w:val="Compact"/>
-              <w:bidi/>
-            </w:pPr>
-            <w:r>
-              <w:rPr>
-                <w:rFonts w:ascii="Tahoma" w:hAnsi="Tahoma" w:cs="Tahoma"/>
-                <w:sz w:val="21"/>
-                <w:szCs w:val="21"/>
-                <w:rtl/>
-              </w:rPr>
-              <w:t xml:space="preserve">ساختار سرمایه و دارایی‌های آن‌ها قابل مقایسه نیست</w:t>
+              <w:t xml:space="preserve">۱ب</w:t>
+            </w:r>
+          </w:p>
+        </w:tc>
+        <w:tc>
+          <w:tcPr/>
+          <w:p>
+            <w:pPr>
+              <w:pStyle w:val="Compact"/>
+              <w:bidi/>
+            </w:pPr>
+            <w:r>
+              <w:rPr>
+                <w:rFonts w:ascii="Tahoma" w:hAnsi="Tahoma" w:cs="Tahoma"/>
+                <w:sz w:val="21"/>
+                <w:szCs w:val="21"/>
+                <w:rtl/>
+              </w:rPr>
+              <w:t xml:space="preserve">سال-شرکت‌های</w:t>
+            </w:r>
+            <w:r>
+              <w:rPr>
+                <w:rFonts w:ascii="Tahoma" w:hAnsi="Tahoma" w:cs="Tahoma"/>
+                <w:sz w:val="21"/>
+                <w:szCs w:val="21"/>
+                <w:rtl/>
+              </w:rPr>
+              <w:t xml:space="preserve"> </w:t>
+            </w:r>
+            <w:r>
+              <w:rPr>
+                <w:rFonts w:ascii="Tahoma" w:hAnsi="Tahoma" w:cs="Tahoma"/>
+                <w:b/>
+                <w:bCs/>
+                <w:sz w:val="21"/>
+                <w:szCs w:val="21"/>
+                <w:rtl/>
+              </w:rPr>
+              <w:t xml:space="preserve">فرابورس حذف شوند</w:t>
+            </w:r>
+            <w:r>
+              <w:rPr>
+                <w:rFonts w:ascii="Tahoma" w:hAnsi="Tahoma" w:cs="Tahoma"/>
+                <w:sz w:val="21"/>
+                <w:szCs w:val="21"/>
+                <w:rtl/>
+              </w:rPr>
+              <w:t xml:space="preserve"> </w:t>
+            </w:r>
+            <w:r>
+              <w:rPr>
+                <w:rFonts w:ascii="Tahoma" w:hAnsi="Tahoma" w:cs="Tahoma"/>
+                <w:sz w:val="21"/>
+                <w:szCs w:val="21"/>
+                <w:rtl/>
+              </w:rPr>
+              <w:t xml:space="preserve">(ستون «بازار»). اگر شرکتی از فرابورس به بورس منتقل شده، فقط سال‌های حضورش در بورس بماند.</w:t>
+            </w:r>
+          </w:p>
+        </w:tc>
+        <w:tc>
+          <w:tcPr/>
+          <w:p>
+            <w:pPr>
+              <w:pStyle w:val="Compact"/>
+              <w:bidi/>
+            </w:pPr>
+            <w:r>
+              <w:rPr>
+                <w:rFonts w:ascii="Tahoma" w:hAnsi="Tahoma" w:cs="Tahoma"/>
+                <w:sz w:val="21"/>
+                <w:szCs w:val="21"/>
+                <w:rtl/>
+              </w:rPr>
+              <w:t xml:space="preserve">روش‌شناسی نمونه را «شرکت‌های بورس تهران» تعریف کرده است. شرایط پذیرش و اندازه‌ی شرکت‌های فرابورس متفاوت است.</w:t>
             </w:r>
           </w:p>
         </w:tc>
@@ -614,81 +681,43 @@
                 <w:szCs w:val="21"/>
                 <w:rtl/>
               </w:rPr>
-              <w:t xml:space="preserve">۳</w:t>
-            </w:r>
-          </w:p>
-        </w:tc>
-        <w:tc>
-          <w:tcPr/>
-          <w:p>
-            <w:pPr>
-              <w:pStyle w:val="Compact"/>
-              <w:bidi/>
-            </w:pPr>
-            <w:r>
-              <w:rPr>
-                <w:rFonts w:ascii="Tahoma" w:hAnsi="Tahoma" w:cs="Tahoma"/>
-                <w:sz w:val="21"/>
-                <w:szCs w:val="21"/>
-                <w:rtl/>
-              </w:rPr>
-              <w:t xml:space="preserve">فقط شرکت‌هایی که سال مالی‌شان</w:t>
-            </w:r>
-            <w:r>
-              <w:rPr>
-                <w:rFonts w:ascii="Tahoma" w:hAnsi="Tahoma" w:cs="Tahoma"/>
-                <w:sz w:val="21"/>
-                <w:szCs w:val="21"/>
-                <w:rtl/>
-              </w:rPr>
-              <w:t xml:space="preserve"> </w:t>
-            </w:r>
-            <w:r>
-              <w:rPr>
-                <w:rFonts w:ascii="Tahoma" w:hAnsi="Tahoma" w:cs="Tahoma"/>
-                <w:b/>
-                <w:bCs/>
-                <w:sz w:val="21"/>
-                <w:szCs w:val="21"/>
-                <w:rtl/>
-              </w:rPr>
-              <w:t xml:space="preserve">پایان اسفند</w:t>
-            </w:r>
-            <w:r>
-              <w:rPr>
-                <w:rFonts w:ascii="Tahoma" w:hAnsi="Tahoma" w:cs="Tahoma"/>
-                <w:sz w:val="21"/>
-                <w:szCs w:val="21"/>
-                <w:rtl/>
-              </w:rPr>
-              <w:t xml:space="preserve"> </w:t>
-            </w:r>
-            <w:r>
-              <w:rPr>
-                <w:rFonts w:ascii="Tahoma" w:hAnsi="Tahoma" w:cs="Tahoma"/>
-                <w:sz w:val="21"/>
-                <w:szCs w:val="21"/>
-                <w:rtl/>
-              </w:rPr>
-              <w:t xml:space="preserve">است. سال‌هایی که شرکت سال مالی خود را تغییر داده (سال مالی کوتاه‌تر یا بلندتر از ۱۲ ماه) حذف شوند.</w:t>
-            </w:r>
-          </w:p>
-        </w:tc>
-        <w:tc>
-          <w:tcPr/>
-          <w:p>
-            <w:pPr>
-              <w:pStyle w:val="Compact"/>
-              <w:bidi/>
-            </w:pPr>
-            <w:r>
-              <w:rPr>
-                <w:rFonts w:ascii="Tahoma" w:hAnsi="Tahoma" w:cs="Tahoma"/>
-                <w:sz w:val="21"/>
-                <w:szCs w:val="21"/>
-                <w:rtl/>
-              </w:rPr>
-              <w:t xml:space="preserve">هم‌زمانی با تورم و اثر سال</w:t>
+              <w:t xml:space="preserve">۲</w:t>
+            </w:r>
+          </w:p>
+        </w:tc>
+        <w:tc>
+          <w:tcPr/>
+          <w:p>
+            <w:pPr>
+              <w:pStyle w:val="Compact"/>
+              <w:bidi/>
+            </w:pPr>
+            <w:r>
+              <w:rPr>
+                <w:rFonts w:ascii="Tahoma" w:hAnsi="Tahoma" w:cs="Tahoma"/>
+                <w:sz w:val="21"/>
+                <w:szCs w:val="21"/>
+                <w:rtl/>
+              </w:rPr>
+              <w:t xml:space="preserve">حذف بانک‌ها، مؤسسات اعتباری، بیمه‌ها، لیزینگ‌ها، شرکت‌های سرمایه‌گذاری، هلدینگ‌ها، کارگزاری‌ها و صندوق‌ها</w:t>
+            </w:r>
+          </w:p>
+        </w:tc>
+        <w:tc>
+          <w:tcPr/>
+          <w:p>
+            <w:pPr>
+              <w:pStyle w:val="Compact"/>
+              <w:bidi/>
+            </w:pPr>
+            <w:r>
+              <w:rPr>
+                <w:rFonts w:ascii="Tahoma" w:hAnsi="Tahoma" w:cs="Tahoma"/>
+                <w:sz w:val="21"/>
+                <w:szCs w:val="21"/>
+                <w:rtl/>
+              </w:rPr>
+              <w:t xml:space="preserve">ساختار سرمایه و دارایی‌های آن‌ها قابل مقایسه نیست</w:t>
             </w:r>
           </w:p>
         </w:tc>
@@ -708,25 +737,25 @@
                 <w:szCs w:val="21"/>
                 <w:rtl/>
               </w:rPr>
-              <w:t xml:space="preserve">۴</w:t>
-            </w:r>
-          </w:p>
-        </w:tc>
-        <w:tc>
-          <w:tcPr/>
-          <w:p>
-            <w:pPr>
-              <w:pStyle w:val="Compact"/>
-              <w:bidi/>
-            </w:pPr>
-            <w:r>
-              <w:rPr>
-                <w:rFonts w:ascii="Tahoma" w:hAnsi="Tahoma" w:cs="Tahoma"/>
-                <w:sz w:val="21"/>
-                <w:szCs w:val="21"/>
-                <w:rtl/>
-              </w:rPr>
-              <w:t xml:space="preserve">حذف سال-شرکت‌هایی که</w:t>
+              <w:t xml:space="preserve">۳</w:t>
+            </w:r>
+          </w:p>
+        </w:tc>
+        <w:tc>
+          <w:tcPr/>
+          <w:p>
+            <w:pPr>
+              <w:pStyle w:val="Compact"/>
+              <w:bidi/>
+            </w:pPr>
+            <w:r>
+              <w:rPr>
+                <w:rFonts w:ascii="Tahoma" w:hAnsi="Tahoma" w:cs="Tahoma"/>
+                <w:sz w:val="21"/>
+                <w:szCs w:val="21"/>
+                <w:rtl/>
+              </w:rPr>
+              <w:t xml:space="preserve">فقط شرکت‌هایی که سال مالی‌شان</w:t>
             </w:r>
             <w:r>
               <w:rPr>
@@ -746,7 +775,7 @@
                 <w:szCs w:val="21"/>
                 <w:rtl/>
               </w:rPr>
-              <w:t xml:space="preserve">توقف نماد بیش از ۶ ماه</w:t>
+              <w:t xml:space="preserve">پایان اسفند</w:t>
             </w:r>
             <w:r>
               <w:rPr>
@@ -764,25 +793,25 @@
                 <w:szCs w:val="21"/>
                 <w:rtl/>
               </w:rPr>
-              <w:t xml:space="preserve">داشته‌اند. اگر حذف نمی‌کنید، برایشان یک ستون نشانگر بسازید.</w:t>
-            </w:r>
-          </w:p>
-        </w:tc>
-        <w:tc>
-          <w:tcPr/>
-          <w:p>
-            <w:pPr>
-              <w:pStyle w:val="Compact"/>
-              <w:bidi/>
-            </w:pPr>
-            <w:r>
-              <w:rPr>
-                <w:rFonts w:ascii="Tahoma" w:hAnsi="Tahoma" w:cs="Tahoma"/>
-                <w:sz w:val="21"/>
-                <w:szCs w:val="21"/>
-                <w:rtl/>
-              </w:rPr>
-              <w:t xml:space="preserve">ارزش بازار (MV) در این سال‌ها قابل اتکا نیست</w:t>
+              <w:t xml:space="preserve">است. سال‌هایی که شرکت سال مالی خود را تغییر داده (سال مالی کوتاه‌تر یا بلندتر از ۱۲ ماه) حذف شوند.</w:t>
+            </w:r>
+          </w:p>
+        </w:tc>
+        <w:tc>
+          <w:tcPr/>
+          <w:p>
+            <w:pPr>
+              <w:pStyle w:val="Compact"/>
+              <w:bidi/>
+            </w:pPr>
+            <w:r>
+              <w:rPr>
+                <w:rFonts w:ascii="Tahoma" w:hAnsi="Tahoma" w:cs="Tahoma"/>
+                <w:sz w:val="21"/>
+                <w:szCs w:val="21"/>
+                <w:rtl/>
+              </w:rPr>
+              <w:t xml:space="preserve">هم‌زمانی با تورم و اثر سال</w:t>
             </w:r>
           </w:p>
         </w:tc>
@@ -802,7 +831,7 @@
                 <w:szCs w:val="21"/>
                 <w:rtl/>
               </w:rPr>
-              <w:t xml:space="preserve">۵</w:t>
+              <w:t xml:space="preserve">۴</w:t>
             </w:r>
           </w:p>
         </w:tc>
@@ -896,7 +925,7 @@
                 <w:szCs w:val="21"/>
                 <w:rtl/>
               </w:rPr>
-              <w:t xml:space="preserve">۶</w:t>
+              <w:t xml:space="preserve">۵</w:t>
             </w:r>
           </w:p>
         </w:tc>
@@ -967,6 +996,40 @@
         </w:tc>
       </w:tr>
     </w:tbl>
+    <w:p>
+      <w:pPr>
+        <w:bidi/>
+      </w:pPr>
+      <w:r>
+        <w:rPr>
+          <w:rFonts w:ascii="Tahoma" w:hAnsi="Tahoma" w:cs="Tahoma"/>
+          <w:b/>
+          <w:bCs/>
+          <w:sz w:val="21"/>
+          <w:szCs w:val="21"/>
+          <w:rtl/>
+        </w:rPr>
+        <w:t xml:space="preserve">توقف نماد:</w:t>
+      </w:r>
+      <w:r>
+        <w:rPr>
+          <w:rFonts w:ascii="Tahoma" w:hAnsi="Tahoma" w:cs="Tahoma"/>
+          <w:sz w:val="21"/>
+          <w:szCs w:val="21"/>
+          <w:rtl/>
+        </w:rPr>
+        <w:t xml:space="preserve"> </w:t>
+      </w:r>
+      <w:r>
+        <w:rPr>
+          <w:rFonts w:ascii="Tahoma" w:hAnsi="Tahoma" w:cs="Tahoma"/>
+          <w:sz w:val="21"/>
+          <w:szCs w:val="21"/>
+          <w:rtl/>
+        </w:rPr>
+        <w:t xml:space="preserve">این داده در دسترس نیست، پس این معیار اعمال نمی‌شود. ارزش بازار پایان سال برای نمادهای متوقف همان آخرین قیمت است. در بخش محدودیت‌های مقاله یک جمله درباره‌اش می‌نویسیم.</w:t>
+      </w:r>
+    </w:p>
     <w:p>
       <w:pPr>
         <w:bidi/>
@@ -1018,6 +1081,357 @@
         <w:t xml:space="preserve">۳. ساختار فایل</w:t>
       </w:r>
     </w:p>
+    <w:p>
+      <w:pPr>
+        <w:bidi/>
+      </w:pPr>
+      <w:r>
+        <w:rPr>
+          <w:rFonts w:ascii="Tahoma" w:hAnsi="Tahoma" w:cs="Tahoma"/>
+          <w:b/>
+          <w:bCs/>
+          <w:sz w:val="21"/>
+          <w:szCs w:val="21"/>
+          <w:rtl/>
+        </w:rPr>
+        <w:t xml:space="preserve">تبدیل ستون‌های شناسه‌ی فایل شما:</w:t>
+      </w:r>
+    </w:p>
+    <w:tbl>
+      <w:tblPr>
+        <w:tblStyle w:val="Table"/>
+        <w:bidiVisual/>
+        <w:tblW w:type="pct" w:w="5000"/>
+        <w:tblBorders>
+          <w:top w:val="single" w:sz="4" w:space="0" w:color="808080"/>
+          <w:left w:val="single" w:sz="4" w:space="0" w:color="808080"/>
+          <w:bottom w:val="single" w:sz="4" w:space="0" w:color="808080"/>
+          <w:right w:val="single" w:sz="4" w:space="0" w:color="808080"/>
+          <w:insideH w:val="single" w:sz="4" w:space="0" w:color="808080"/>
+          <w:insideV w:val="single" w:sz="4" w:space="0" w:color="808080"/>
+        </w:tblBorders>
+        <w:tblLayout w:type="fixed"/>
+        <w:tblLook w:firstRow="1" w:lastRow="0" w:firstColumn="0" w:lastColumn="0" w:noHBand="0" w:noVBand="0" w:val="0020"/>
+      </w:tblPr>
+      <w:tblGrid>
+        <w:gridCol w:w="3960"/>
+        <w:gridCol w:w="3960"/>
+      </w:tblGrid>
+      <w:tr>
+        <w:trPr>
+          <w:tblHeader w:val="on"/>
+        </w:trPr>
+        <w:tc>
+          <w:tcPr>
+            <w:shd w:val="clear" w:color="auto" w:fill="E8ECF3"/>
+          </w:tcPr>
+          <w:p>
+            <w:pPr>
+              <w:pStyle w:val="Compact"/>
+              <w:bidi/>
+            </w:pPr>
+            <w:r>
+              <w:rPr>
+                <w:rFonts w:ascii="Tahoma" w:hAnsi="Tahoma" w:cs="Tahoma"/>
+                <w:b/>
+                <w:sz w:val="21"/>
+                <w:szCs w:val="21"/>
+                <w:rtl/>
+              </w:rPr>
+              <w:t xml:space="preserve">ستون فعلی شما</w:t>
+            </w:r>
+          </w:p>
+        </w:tc>
+        <w:tc>
+          <w:tcPr>
+            <w:shd w:val="clear" w:color="auto" w:fill="E8ECF3"/>
+          </w:tcPr>
+          <w:p>
+            <w:pPr>
+              <w:pStyle w:val="Compact"/>
+              <w:bidi/>
+            </w:pPr>
+            <w:r>
+              <w:rPr>
+                <w:rFonts w:ascii="Tahoma" w:hAnsi="Tahoma" w:cs="Tahoma"/>
+                <w:b/>
+                <w:sz w:val="21"/>
+                <w:szCs w:val="21"/>
+                <w:rtl/>
+              </w:rPr>
+              <w:t xml:space="preserve">نام جدید در فایل نهایی</w:t>
+            </w:r>
+          </w:p>
+        </w:tc>
+      </w:tr>
+      <w:tr>
+        <w:tc>
+          <w:tcPr/>
+          <w:p>
+            <w:pPr>
+              <w:pStyle w:val="Compact"/>
+              <w:bidi/>
+            </w:pPr>
+            <w:r>
+              <w:rPr>
+                <w:rFonts w:ascii="Tahoma" w:hAnsi="Tahoma" w:cs="Tahoma"/>
+                <w:sz w:val="21"/>
+                <w:szCs w:val="21"/>
+                <w:rtl/>
+              </w:rPr>
+              <w:t xml:space="preserve">شرکت (firmcode)</w:t>
+            </w:r>
+          </w:p>
+        </w:tc>
+        <w:tc>
+          <w:tcPr/>
+          <w:p>
+            <w:pPr>
+              <w:pStyle w:val="Compact"/>
+              <w:bidi/>
+            </w:pPr>
+            <w:r>
+              <w:rPr>
+                <w:rFonts w:ascii="Tahoma" w:hAnsi="Tahoma" w:cs="Tahoma"/>
+                <w:b/>
+                <w:bCs/>
+                <w:sz w:val="21"/>
+                <w:szCs w:val="21"/>
+                <w:rtl/>
+              </w:rPr>
+              <w:t xml:space="preserve">FirmCode</w:t>
+            </w:r>
+          </w:p>
+        </w:tc>
+      </w:tr>
+      <w:tr>
+        <w:tc>
+          <w:tcPr/>
+          <w:p>
+            <w:pPr>
+              <w:pStyle w:val="Compact"/>
+              <w:bidi/>
+            </w:pPr>
+            <w:r>
+              <w:rPr>
+                <w:rFonts w:ascii="Tahoma" w:hAnsi="Tahoma" w:cs="Tahoma"/>
+                <w:sz w:val="21"/>
+                <w:szCs w:val="21"/>
+                <w:rtl/>
+              </w:rPr>
+              <w:t xml:space="preserve">سال مالی (year)</w:t>
+            </w:r>
+          </w:p>
+        </w:tc>
+        <w:tc>
+          <w:tcPr/>
+          <w:p>
+            <w:pPr>
+              <w:pStyle w:val="Compact"/>
+              <w:bidi/>
+            </w:pPr>
+            <w:r>
+              <w:rPr>
+                <w:rFonts w:ascii="Tahoma" w:hAnsi="Tahoma" w:cs="Tahoma"/>
+                <w:b/>
+                <w:bCs/>
+                <w:sz w:val="21"/>
+                <w:szCs w:val="21"/>
+                <w:rtl/>
+              </w:rPr>
+              <w:t xml:space="preserve">Year</w:t>
+            </w:r>
+          </w:p>
+        </w:tc>
+      </w:tr>
+      <w:tr>
+        <w:tc>
+          <w:tcPr/>
+          <w:p>
+            <w:pPr>
+              <w:pStyle w:val="Compact"/>
+              <w:bidi/>
+            </w:pPr>
+            <w:r>
+              <w:rPr>
+                <w:rFonts w:ascii="Tahoma" w:hAnsi="Tahoma" w:cs="Tahoma"/>
+                <w:sz w:val="21"/>
+                <w:szCs w:val="21"/>
+                <w:rtl/>
+              </w:rPr>
+              <w:t xml:space="preserve">کدصنعت کلی (ind)</w:t>
+            </w:r>
+          </w:p>
+        </w:tc>
+        <w:tc>
+          <w:tcPr/>
+          <w:p>
+            <w:pPr>
+              <w:pStyle w:val="Compact"/>
+              <w:bidi/>
+            </w:pPr>
+            <w:r>
+              <w:rPr>
+                <w:rFonts w:ascii="Tahoma" w:hAnsi="Tahoma" w:cs="Tahoma"/>
+                <w:b/>
+                <w:bCs/>
+                <w:sz w:val="21"/>
+                <w:szCs w:val="21"/>
+                <w:rtl/>
+              </w:rPr>
+              <w:t xml:space="preserve">IndID</w:t>
+            </w:r>
+          </w:p>
+        </w:tc>
+      </w:tr>
+      <w:tr>
+        <w:tc>
+          <w:tcPr/>
+          <w:p>
+            <w:pPr>
+              <w:pStyle w:val="Compact"/>
+              <w:bidi/>
+            </w:pPr>
+            <w:r>
+              <w:rPr>
+                <w:rFonts w:ascii="Tahoma" w:hAnsi="Tahoma" w:cs="Tahoma"/>
+                <w:sz w:val="21"/>
+                <w:szCs w:val="21"/>
+                <w:rtl/>
+              </w:rPr>
+              <w:t xml:space="preserve">صنعت (industry)</w:t>
+            </w:r>
+          </w:p>
+        </w:tc>
+        <w:tc>
+          <w:tcPr/>
+          <w:p>
+            <w:pPr>
+              <w:pStyle w:val="Compact"/>
+              <w:bidi/>
+            </w:pPr>
+            <w:r>
+              <w:rPr>
+                <w:rFonts w:ascii="Tahoma" w:hAnsi="Tahoma" w:cs="Tahoma"/>
+                <w:b/>
+                <w:bCs/>
+                <w:sz w:val="21"/>
+                <w:szCs w:val="21"/>
+                <w:rtl/>
+              </w:rPr>
+              <w:t xml:space="preserve">Industry</w:t>
+            </w:r>
+          </w:p>
+        </w:tc>
+      </w:tr>
+      <w:tr>
+        <w:tc>
+          <w:tcPr/>
+          <w:p>
+            <w:pPr>
+              <w:pStyle w:val="Compact"/>
+              <w:bidi/>
+            </w:pPr>
+            <w:r>
+              <w:rPr>
+                <w:rFonts w:ascii="Tahoma" w:hAnsi="Tahoma" w:cs="Tahoma"/>
+                <w:sz w:val="21"/>
+                <w:szCs w:val="21"/>
+                <w:rtl/>
+              </w:rPr>
+              <w:t xml:space="preserve">نماد (x2)</w:t>
+            </w:r>
+          </w:p>
+        </w:tc>
+        <w:tc>
+          <w:tcPr/>
+          <w:p>
+            <w:pPr>
+              <w:pStyle w:val="Compact"/>
+              <w:bidi/>
+            </w:pPr>
+            <w:r>
+              <w:rPr>
+                <w:rFonts w:ascii="Tahoma" w:hAnsi="Tahoma" w:cs="Tahoma"/>
+                <w:b/>
+                <w:bCs/>
+                <w:sz w:val="21"/>
+                <w:szCs w:val="21"/>
+                <w:rtl/>
+              </w:rPr>
+              <w:t xml:space="preserve">Symbol</w:t>
+            </w:r>
+          </w:p>
+        </w:tc>
+      </w:tr>
+      <w:tr>
+        <w:tc>
+          <w:tcPr/>
+          <w:p>
+            <w:pPr>
+              <w:pStyle w:val="Compact"/>
+              <w:bidi/>
+            </w:pPr>
+            <w:r>
+              <w:rPr>
+                <w:rFonts w:ascii="Tahoma" w:hAnsi="Tahoma" w:cs="Tahoma"/>
+                <w:sz w:val="21"/>
+                <w:szCs w:val="21"/>
+                <w:rtl/>
+              </w:rPr>
+              <w:t xml:space="preserve">شرکت (firm)، کد صنعت جزئی، طبقه، بازار (x1)</w:t>
+            </w:r>
+          </w:p>
+        </w:tc>
+        <w:tc>
+          <w:tcPr/>
+          <w:p>
+            <w:pPr>
+              <w:pStyle w:val="Compact"/>
+              <w:bidi/>
+            </w:pPr>
+            <w:r>
+              <w:rPr>
+                <w:rFonts w:ascii="Tahoma" w:hAnsi="Tahoma" w:cs="Tahoma"/>
+                <w:sz w:val="21"/>
+                <w:szCs w:val="21"/>
+                <w:rtl/>
+              </w:rPr>
+              <w:t xml:space="preserve">بعد از غربالگری</w:t>
+            </w:r>
+            <w:r>
+              <w:rPr>
+                <w:rFonts w:ascii="Tahoma" w:hAnsi="Tahoma" w:cs="Tahoma"/>
+                <w:sz w:val="21"/>
+                <w:szCs w:val="21"/>
+                <w:rtl/>
+              </w:rPr>
+              <w:t xml:space="preserve"> </w:t>
+            </w:r>
+            <w:r>
+              <w:rPr>
+                <w:rFonts w:ascii="Tahoma" w:hAnsi="Tahoma" w:cs="Tahoma"/>
+                <w:b/>
+                <w:bCs/>
+                <w:sz w:val="21"/>
+                <w:szCs w:val="21"/>
+                <w:rtl/>
+              </w:rPr>
+              <w:t xml:space="preserve">حذف شوند</w:t>
+            </w:r>
+            <w:r>
+              <w:rPr>
+                <w:rFonts w:ascii="Tahoma" w:hAnsi="Tahoma" w:cs="Tahoma"/>
+                <w:sz w:val="21"/>
+                <w:szCs w:val="21"/>
+                <w:rtl/>
+              </w:rPr>
+              <w:t xml:space="preserve">. دو ستون با نام یکسان industry در فایل نماند.</w:t>
+            </w:r>
+          </w:p>
+        </w:tc>
+      </w:tr>
+    </w:tbl>
     <w:p>
       <w:pPr>
         <w:pStyle w:val="Compact"/>
@@ -1400,45 +1814,25 @@
                 <w:szCs w:val="21"/>
                 <w:rtl/>
               </w:rPr>
-              <w:t xml:space="preserve">کد ثابت شرکت (شناسه ملی یا کد ISIN)</w:t>
-            </w:r>
-          </w:p>
-        </w:tc>
-        <w:tc>
-          <w:tcPr/>
-          <w:p>
-            <w:pPr>
-              <w:pStyle w:val="Compact"/>
-              <w:bidi/>
-            </w:pPr>
-            <w:r>
-              <w:rPr>
-                <w:rFonts w:ascii="Tahoma" w:hAnsi="Tahoma" w:cs="Tahoma"/>
-                <w:b/>
-                <w:bCs/>
-                <w:sz w:val="21"/>
-                <w:szCs w:val="21"/>
-                <w:rtl/>
-              </w:rPr>
-              <w:t xml:space="preserve">ستون جدید.</w:t>
-            </w:r>
-            <w:r>
-              <w:rPr>
-                <w:rFonts w:ascii="Tahoma" w:hAnsi="Tahoma" w:cs="Tahoma"/>
-                <w:sz w:val="21"/>
-                <w:szCs w:val="21"/>
-                <w:rtl/>
-              </w:rPr>
-              <w:t xml:space="preserve"> </w:t>
-            </w:r>
-            <w:r>
-              <w:rPr>
-                <w:rFonts w:ascii="Tahoma" w:hAnsi="Tahoma" w:cs="Tahoma"/>
-                <w:sz w:val="21"/>
-                <w:szCs w:val="21"/>
-                <w:rtl/>
-              </w:rPr>
-              <w:t xml:space="preserve">نماد شرکت‌ها در طول ۲۴ سال گاهی عوض شده است. این کد باید برای هر شرکت در همه‌ی سال‌ها یکی باشد.</w:t>
+              <w:t xml:space="preserve">کد شرکت در پایگاه داده (ستون firmcode فایل شما)</w:t>
+            </w:r>
+          </w:p>
+        </w:tc>
+        <w:tc>
+          <w:tcPr/>
+          <w:p>
+            <w:pPr>
+              <w:pStyle w:val="Compact"/>
+              <w:bidi/>
+            </w:pPr>
+            <w:r>
+              <w:rPr>
+                <w:rFonts w:ascii="Tahoma" w:hAnsi="Tahoma" w:cs="Tahoma"/>
+                <w:sz w:val="21"/>
+                <w:szCs w:val="21"/>
+                <w:rtl/>
+              </w:rPr>
+              <w:t xml:space="preserve">نماد شرکت‌ها در طول ۲۴ سال گاهی عوض شده است، ولی کد شرکت در پایگاه داده ثابت می‌ماند.</w:t>
             </w:r>
           </w:p>
         </w:tc>
@@ -1632,7 +2026,7 @@
                 <w:szCs w:val="21"/>
                 <w:rtl/>
               </w:rPr>
-              <w:t xml:space="preserve">نام صنعت</w:t>
+              <w:t xml:space="preserve">نام صنعت (متناظر با کد صنعت کلی)</w:t>
             </w:r>
           </w:p>
         </w:tc>
@@ -1686,31 +2080,13 @@
             <w:r>
               <w:rPr>
                 <w:rFonts w:ascii="Tahoma" w:hAnsi="Tahoma" w:cs="Tahoma"/>
-                <w:sz w:val="21"/>
-                <w:szCs w:val="21"/>
-                <w:rtl/>
-              </w:rPr>
-              <w:t xml:space="preserve">کد عددی صنعت</w:t>
-            </w:r>
-          </w:p>
-        </w:tc>
-        <w:tc>
-          <w:tcPr/>
-          <w:p>
-            <w:pPr>
-              <w:pStyle w:val="Compact"/>
-              <w:bidi/>
-            </w:pPr>
-            <w:r>
-              <w:rPr>
-                <w:rFonts w:ascii="Tahoma" w:hAnsi="Tahoma" w:cs="Tahoma"/>
                 <w:b/>
                 <w:bCs/>
                 <w:sz w:val="21"/>
                 <w:szCs w:val="21"/>
                 <w:rtl/>
               </w:rPr>
-              <w:t xml:space="preserve">برای هر شرکت در همه‌ی سال‌ها ثابت باشد.</w:t>
+              <w:t xml:space="preserve">کد صنعت کلی</w:t>
             </w:r>
             <w:r>
               <w:rPr>
@@ -1728,7 +2104,25 @@
                 <w:szCs w:val="21"/>
                 <w:rtl/>
               </w:rPr>
-              <w:t xml:space="preserve">اگر صنعت شرکتی تغییر کرده، صنعت اصلی آن را برای کل دوره بنویسید.</w:t>
+              <w:t xml:space="preserve">(نه کد جزئی)</w:t>
+            </w:r>
+          </w:p>
+        </w:tc>
+        <w:tc>
+          <w:tcPr/>
+          <w:p>
+            <w:pPr>
+              <w:pStyle w:val="Compact"/>
+              <w:bidi/>
+            </w:pPr>
+            <w:r>
+              <w:rPr>
+                <w:rFonts w:ascii="Tahoma" w:hAnsi="Tahoma" w:cs="Tahoma"/>
+                <w:sz w:val="21"/>
+                <w:szCs w:val="21"/>
+                <w:rtl/>
+              </w:rPr>
+              <w:t xml:space="preserve">کد جزئی صنایع خیلی کوچک می‌سازد. مدل سرمایه‌گذاری هر صنعت-سال را با دست‌کم ۱۰ شرکت جداگانه برآورد می‌کند.</w:t>
             </w:r>
           </w:p>
         </w:tc>

</xml_diff>

<commit_message>
Screening: no minimum-years filter; sample-construction counts written to T0_sample
Co-Authored-By: Claude Opus 5.5 <noreply@anthropic.com>
Claude-Session: https://claude.ai/code/session_019etBaQcYpfE848z3Ex8rct
</commit_message>
<xml_diff>
--- a/docs/Data_Collection_Guide.docx
+++ b/docs/Data_Collection_Guide.docx
@@ -299,7 +299,7 @@
           <w:szCs w:val="21"/>
           <w:rtl/>
         </w:rPr>
-        <w:t xml:space="preserve">مراحل زیر را به همین ترتیب اجرا کنید و</w:t>
+        <w:t xml:space="preserve">غربالگری دستی (در اکسل) فقط سه مرحله است.</w:t>
       </w:r>
       <w:r>
         <w:rPr>
@@ -328,7 +328,7 @@
           <w:szCs w:val="21"/>
           <w:rtl/>
         </w:rPr>
-        <w:t xml:space="preserve">. این اعداد مستقیماً در جدول نمونه‌ی مقاله (بخش 3.1) می‌آیند.</w:t>
+        <w:t xml:space="preserve">؛ این اعداد مستقیماً در جدول نمونه‌ی مقاله (بخش 3.1) می‌آیند.</w:t>
       </w:r>
     </w:p>
     <w:tbl>
@@ -511,16 +511,7 @@
                 <w:szCs w:val="21"/>
                 <w:rtl/>
               </w:rPr>
-              <w:t xml:space="preserve">بعد از ۱۳۸۰ پذیرفته شده‌اند هم بیایند</w:t>
-            </w:r>
-            <w:r>
-              <w:rPr>
-                <w:rFonts w:ascii="Tahoma" w:hAnsi="Tahoma" w:cs="Tahoma"/>
-                <w:sz w:val="21"/>
-                <w:szCs w:val="21"/>
-                <w:rtl/>
-              </w:rPr>
-              <w:t xml:space="preserve">، از اولین سالی که داده دارند. شرکت‌هایی که بعداً از بورس خارج شده‌اند هم</w:t>
+              <w:t xml:space="preserve">بعد از ۱۳۸۰ پذیرفته شده‌اند</w:t>
             </w:r>
             <w:r>
               <w:rPr>
@@ -534,22 +525,49 @@
             <w:r>
               <w:rPr>
                 <w:rFonts w:ascii="Tahoma" w:hAnsi="Tahoma" w:cs="Tahoma"/>
+                <w:sz w:val="21"/>
+                <w:szCs w:val="21"/>
+                <w:rtl/>
+              </w:rPr>
+              <w:t xml:space="preserve">از اولین سالی که داده دارند وارد می‌شوند. شرکت‌هایی که</w:t>
+            </w:r>
+            <w:r>
+              <w:rPr>
+                <w:rFonts w:ascii="Tahoma" w:hAnsi="Tahoma" w:cs="Tahoma"/>
+                <w:sz w:val="21"/>
+                <w:szCs w:val="21"/>
+                <w:rtl/>
+              </w:rPr>
+              <w:t xml:space="preserve"> </w:t>
+            </w:r>
+            <w:r>
+              <w:rPr>
+                <w:rFonts w:ascii="Tahoma" w:hAnsi="Tahoma" w:cs="Tahoma"/>
                 <w:b/>
                 <w:bCs/>
                 <w:sz w:val="21"/>
                 <w:szCs w:val="21"/>
                 <w:rtl/>
               </w:rPr>
-              <w:t xml:space="preserve">حذف نشوند</w:t>
-            </w:r>
-            <w:r>
-              <w:rPr>
-                <w:rFonts w:ascii="Tahoma" w:hAnsi="Tahoma" w:cs="Tahoma"/>
-                <w:sz w:val="21"/>
-                <w:szCs w:val="21"/>
-                <w:rtl/>
-              </w:rPr>
-              <w:t xml:space="preserve">.</w:t>
+              <w:t xml:space="preserve">بعداً از بورس خارج شده‌اند</w:t>
+            </w:r>
+            <w:r>
+              <w:rPr>
+                <w:rFonts w:ascii="Tahoma" w:hAnsi="Tahoma" w:cs="Tahoma"/>
+                <w:sz w:val="21"/>
+                <w:szCs w:val="21"/>
+                <w:rtl/>
+              </w:rPr>
+              <w:t xml:space="preserve"> </w:t>
+            </w:r>
+            <w:r>
+              <w:rPr>
+                <w:rFonts w:ascii="Tahoma" w:hAnsi="Tahoma" w:cs="Tahoma"/>
+                <w:sz w:val="21"/>
+                <w:szCs w:val="21"/>
+                <w:rtl/>
+              </w:rPr>
+              <w:t xml:space="preserve">حذف نمی‌شوند.</w:t>
             </w:r>
           </w:p>
         </w:tc>
@@ -587,7 +605,7 @@
                 <w:szCs w:val="21"/>
                 <w:rtl/>
               </w:rPr>
-              <w:t xml:space="preserve">۱ب</w:t>
+              <w:t xml:space="preserve">۲</w:t>
             </w:r>
           </w:p>
         </w:tc>
@@ -625,7 +643,7 @@
                 <w:szCs w:val="21"/>
                 <w:rtl/>
               </w:rPr>
-              <w:t xml:space="preserve">فرابورس حذف شوند</w:t>
+              <w:t xml:space="preserve">فرابورس</w:t>
             </w:r>
             <w:r>
               <w:rPr>
@@ -643,25 +661,25 @@
                 <w:szCs w:val="21"/>
                 <w:rtl/>
               </w:rPr>
-              <w:t xml:space="preserve">(ستون «بازار»). اگر شرکتی از فرابورس به بورس منتقل شده، فقط سال‌های حضورش در بورس بماند.</w:t>
-            </w:r>
-          </w:p>
-        </w:tc>
-        <w:tc>
-          <w:tcPr/>
-          <w:p>
-            <w:pPr>
-              <w:pStyle w:val="Compact"/>
-              <w:bidi/>
-            </w:pPr>
-            <w:r>
-              <w:rPr>
-                <w:rFonts w:ascii="Tahoma" w:hAnsi="Tahoma" w:cs="Tahoma"/>
-                <w:sz w:val="21"/>
-                <w:szCs w:val="21"/>
-                <w:rtl/>
-              </w:rPr>
-              <w:t xml:space="preserve">روش‌شناسی نمونه را «شرکت‌های بورس تهران» تعریف کرده است. شرایط پذیرش و اندازه‌ی شرکت‌های فرابورس متفاوت است.</w:t>
+              <w:t xml:space="preserve">حذف شوند (ستون «بازار»). اگر شرکتی از فرابورس به بورس منتقل شده، فقط سال‌های حضورش در بورس بماند.</w:t>
+            </w:r>
+          </w:p>
+        </w:tc>
+        <w:tc>
+          <w:tcPr/>
+          <w:p>
+            <w:pPr>
+              <w:pStyle w:val="Compact"/>
+              <w:bidi/>
+            </w:pPr>
+            <w:r>
+              <w:rPr>
+                <w:rFonts w:ascii="Tahoma" w:hAnsi="Tahoma" w:cs="Tahoma"/>
+                <w:sz w:val="21"/>
+                <w:szCs w:val="21"/>
+                <w:rtl/>
+              </w:rPr>
+              <w:t xml:space="preserve">نمونه، شرکت‌های بورس تهران است؛ شرایط پذیرش و اندازه‌ی شرکت‌های فرابورس متفاوت است</w:t>
             </w:r>
           </w:p>
         </w:tc>
@@ -681,7 +699,7 @@
                 <w:szCs w:val="21"/>
                 <w:rtl/>
               </w:rPr>
-              <w:t xml:space="preserve">۲</w:t>
+              <w:t xml:space="preserve">۳</w:t>
             </w:r>
           </w:p>
         </w:tc>
@@ -718,279 +736,6 @@
                 <w:rtl/>
               </w:rPr>
               <w:t xml:space="preserve">ساختار سرمایه و دارایی‌های آن‌ها قابل مقایسه نیست</w:t>
-            </w:r>
-          </w:p>
-        </w:tc>
-      </w:tr>
-      <w:tr>
-        <w:tc>
-          <w:tcPr/>
-          <w:p>
-            <w:pPr>
-              <w:pStyle w:val="Compact"/>
-              <w:bidi/>
-            </w:pPr>
-            <w:r>
-              <w:rPr>
-                <w:rFonts w:ascii="Tahoma" w:hAnsi="Tahoma" w:cs="Tahoma"/>
-                <w:sz w:val="21"/>
-                <w:szCs w:val="21"/>
-                <w:rtl/>
-              </w:rPr>
-              <w:t xml:space="preserve">۳</w:t>
-            </w:r>
-          </w:p>
-        </w:tc>
-        <w:tc>
-          <w:tcPr/>
-          <w:p>
-            <w:pPr>
-              <w:pStyle w:val="Compact"/>
-              <w:bidi/>
-            </w:pPr>
-            <w:r>
-              <w:rPr>
-                <w:rFonts w:ascii="Tahoma" w:hAnsi="Tahoma" w:cs="Tahoma"/>
-                <w:sz w:val="21"/>
-                <w:szCs w:val="21"/>
-                <w:rtl/>
-              </w:rPr>
-              <w:t xml:space="preserve">فقط شرکت‌هایی که سال مالی‌شان</w:t>
-            </w:r>
-            <w:r>
-              <w:rPr>
-                <w:rFonts w:ascii="Tahoma" w:hAnsi="Tahoma" w:cs="Tahoma"/>
-                <w:sz w:val="21"/>
-                <w:szCs w:val="21"/>
-                <w:rtl/>
-              </w:rPr>
-              <w:t xml:space="preserve"> </w:t>
-            </w:r>
-            <w:r>
-              <w:rPr>
-                <w:rFonts w:ascii="Tahoma" w:hAnsi="Tahoma" w:cs="Tahoma"/>
-                <w:b/>
-                <w:bCs/>
-                <w:sz w:val="21"/>
-                <w:szCs w:val="21"/>
-                <w:rtl/>
-              </w:rPr>
-              <w:t xml:space="preserve">پایان اسفند</w:t>
-            </w:r>
-            <w:r>
-              <w:rPr>
-                <w:rFonts w:ascii="Tahoma" w:hAnsi="Tahoma" w:cs="Tahoma"/>
-                <w:sz w:val="21"/>
-                <w:szCs w:val="21"/>
-                <w:rtl/>
-              </w:rPr>
-              <w:t xml:space="preserve"> </w:t>
-            </w:r>
-            <w:r>
-              <w:rPr>
-                <w:rFonts w:ascii="Tahoma" w:hAnsi="Tahoma" w:cs="Tahoma"/>
-                <w:sz w:val="21"/>
-                <w:szCs w:val="21"/>
-                <w:rtl/>
-              </w:rPr>
-              <w:t xml:space="preserve">است. سال‌هایی که شرکت سال مالی خود را تغییر داده (سال مالی کوتاه‌تر یا بلندتر از ۱۲ ماه) حذف شوند.</w:t>
-            </w:r>
-          </w:p>
-        </w:tc>
-        <w:tc>
-          <w:tcPr/>
-          <w:p>
-            <w:pPr>
-              <w:pStyle w:val="Compact"/>
-              <w:bidi/>
-            </w:pPr>
-            <w:r>
-              <w:rPr>
-                <w:rFonts w:ascii="Tahoma" w:hAnsi="Tahoma" w:cs="Tahoma"/>
-                <w:sz w:val="21"/>
-                <w:szCs w:val="21"/>
-                <w:rtl/>
-              </w:rPr>
-              <w:t xml:space="preserve">هم‌زمانی با تورم و اثر سال</w:t>
-            </w:r>
-          </w:p>
-        </w:tc>
-      </w:tr>
-      <w:tr>
-        <w:tc>
-          <w:tcPr/>
-          <w:p>
-            <w:pPr>
-              <w:pStyle w:val="Compact"/>
-              <w:bidi/>
-            </w:pPr>
-            <w:r>
-              <w:rPr>
-                <w:rFonts w:ascii="Tahoma" w:hAnsi="Tahoma" w:cs="Tahoma"/>
-                <w:sz w:val="21"/>
-                <w:szCs w:val="21"/>
-                <w:rtl/>
-              </w:rPr>
-              <w:t xml:space="preserve">۴</w:t>
-            </w:r>
-          </w:p>
-        </w:tc>
-        <w:tc>
-          <w:tcPr/>
-          <w:p>
-            <w:pPr>
-              <w:pStyle w:val="Compact"/>
-              <w:bidi/>
-            </w:pPr>
-            <w:r>
-              <w:rPr>
-                <w:rFonts w:ascii="Tahoma" w:hAnsi="Tahoma" w:cs="Tahoma"/>
-                <w:sz w:val="21"/>
-                <w:szCs w:val="21"/>
-                <w:rtl/>
-              </w:rPr>
-              <w:t xml:space="preserve">هر شرکت دست‌کم</w:t>
-            </w:r>
-            <w:r>
-              <w:rPr>
-                <w:rFonts w:ascii="Tahoma" w:hAnsi="Tahoma" w:cs="Tahoma"/>
-                <w:sz w:val="21"/>
-                <w:szCs w:val="21"/>
-                <w:rtl/>
-              </w:rPr>
-              <w:t xml:space="preserve"> </w:t>
-            </w:r>
-            <w:r>
-              <w:rPr>
-                <w:rFonts w:ascii="Tahoma" w:hAnsi="Tahoma" w:cs="Tahoma"/>
-                <w:b/>
-                <w:bCs/>
-                <w:sz w:val="21"/>
-                <w:szCs w:val="21"/>
-                <w:rtl/>
-              </w:rPr>
-              <w:t xml:space="preserve">۶ سال پیاپی</w:t>
-            </w:r>
-            <w:r>
-              <w:rPr>
-                <w:rFonts w:ascii="Tahoma" w:hAnsi="Tahoma" w:cs="Tahoma"/>
-                <w:sz w:val="21"/>
-                <w:szCs w:val="21"/>
-                <w:rtl/>
-              </w:rPr>
-              <w:t xml:space="preserve"> </w:t>
-            </w:r>
-            <w:r>
-              <w:rPr>
-                <w:rFonts w:ascii="Tahoma" w:hAnsi="Tahoma" w:cs="Tahoma"/>
-                <w:sz w:val="21"/>
-                <w:szCs w:val="21"/>
-                <w:rtl/>
-              </w:rPr>
-              <w:t xml:space="preserve">داده‌ی کامل داشته باشد. لازم نیست شرکت در کل دوره حضور داشته باشد (پنل نامتوازن).</w:t>
-            </w:r>
-          </w:p>
-        </w:tc>
-        <w:tc>
-          <w:tcPr/>
-          <w:p>
-            <w:pPr>
-              <w:pStyle w:val="Compact"/>
-              <w:bidi/>
-            </w:pPr>
-            <w:r>
-              <w:rPr>
-                <w:rFonts w:ascii="Tahoma" w:hAnsi="Tahoma" w:cs="Tahoma"/>
-                <w:sz w:val="21"/>
-                <w:szCs w:val="21"/>
-                <w:rtl/>
-              </w:rPr>
-              <w:t xml:space="preserve">مدل به وقفه‌های تا t−3 نیاز دارد، پس شرکت با کمتر از ۶ سال پیاپی هیچ مشاهده‌ای به برآورد اضافه نمی‌کند</w:t>
-            </w:r>
-          </w:p>
-        </w:tc>
-      </w:tr>
-      <w:tr>
-        <w:tc>
-          <w:tcPr/>
-          <w:p>
-            <w:pPr>
-              <w:pStyle w:val="Compact"/>
-              <w:bidi/>
-            </w:pPr>
-            <w:r>
-              <w:rPr>
-                <w:rFonts w:ascii="Tahoma" w:hAnsi="Tahoma" w:cs="Tahoma"/>
-                <w:sz w:val="21"/>
-                <w:szCs w:val="21"/>
-                <w:rtl/>
-              </w:rPr>
-              <w:t xml:space="preserve">۵</w:t>
-            </w:r>
-          </w:p>
-        </w:tc>
-        <w:tc>
-          <w:tcPr/>
-          <w:p>
-            <w:pPr>
-              <w:pStyle w:val="Compact"/>
-              <w:bidi/>
-            </w:pPr>
-            <w:r>
-              <w:rPr>
-                <w:rFonts w:ascii="Tahoma" w:hAnsi="Tahoma" w:cs="Tahoma"/>
-                <w:sz w:val="21"/>
-                <w:szCs w:val="21"/>
-                <w:rtl/>
-              </w:rPr>
-              <w:t xml:space="preserve">سال-شرکت‌هایی را که حقوق صاحبان سهام صفر یا منفی دارند</w:t>
-            </w:r>
-            <w:r>
-              <w:rPr>
-                <w:rFonts w:ascii="Tahoma" w:hAnsi="Tahoma" w:cs="Tahoma"/>
-                <w:sz w:val="21"/>
-                <w:szCs w:val="21"/>
-                <w:rtl/>
-              </w:rPr>
-              <w:t xml:space="preserve"> </w:t>
-            </w:r>
-            <w:r>
-              <w:rPr>
-                <w:rFonts w:ascii="Tahoma" w:hAnsi="Tahoma" w:cs="Tahoma"/>
-                <w:b/>
-                <w:bCs/>
-                <w:sz w:val="21"/>
-                <w:szCs w:val="21"/>
-                <w:rtl/>
-              </w:rPr>
-              <w:t xml:space="preserve">خودتان حذف نکنید</w:t>
-            </w:r>
-            <w:r>
-              <w:rPr>
-                <w:rFonts w:ascii="Tahoma" w:hAnsi="Tahoma" w:cs="Tahoma"/>
-                <w:sz w:val="21"/>
-                <w:szCs w:val="21"/>
-                <w:rtl/>
-              </w:rPr>
-              <w:t xml:space="preserve">.</w:t>
-            </w:r>
-          </w:p>
-        </w:tc>
-        <w:tc>
-          <w:tcPr/>
-          <w:p>
-            <w:pPr>
-              <w:pStyle w:val="Compact"/>
-              <w:bidi/>
-            </w:pPr>
-            <w:r>
-              <w:rPr>
-                <w:rFonts w:ascii="Tahoma" w:hAnsi="Tahoma" w:cs="Tahoma"/>
-                <w:sz w:val="21"/>
-                <w:szCs w:val="21"/>
-                <w:rtl/>
-              </w:rPr>
-              <w:t xml:space="preserve">کد آن‌ها را حذف می‌کند و تعدادشان را در لاگ گزارش می‌دهد</w:t>
             </w:r>
           </w:p>
         </w:tc>
@@ -1009,29 +754,16 @@
           <w:szCs w:val="21"/>
           <w:rtl/>
         </w:rPr>
-        <w:t xml:space="preserve">توقف نماد:</w:t>
-      </w:r>
-      <w:r>
-        <w:rPr>
-          <w:rFonts w:ascii="Tahoma" w:hAnsi="Tahoma" w:cs="Tahoma"/>
-          <w:sz w:val="21"/>
-          <w:szCs w:val="21"/>
-          <w:rtl/>
-        </w:rPr>
-        <w:t xml:space="preserve"> </w:t>
-      </w:r>
-      <w:r>
-        <w:rPr>
-          <w:rFonts w:ascii="Tahoma" w:hAnsi="Tahoma" w:cs="Tahoma"/>
-          <w:sz w:val="21"/>
-          <w:szCs w:val="21"/>
-          <w:rtl/>
-        </w:rPr>
-        <w:t xml:space="preserve">این داده در دسترس نیست، پس این معیار اعمال نمی‌شود. ارزش بازار پایان سال برای نمادهای متوقف همان آخرین قیمت است. در بخش محدودیت‌های مقاله یک جمله درباره‌اش می‌نویسیم.</w:t>
+        <w:t xml:space="preserve">مواردی که در اکسل حذف نمی‌کنید:</w:t>
       </w:r>
     </w:p>
     <w:p>
       <w:pPr>
+        <w:pStyle w:val="Compact"/>
+        <w:numPr>
+          <w:ilvl w:val="0"/>
+          <w:numId w:val="1003"/>
+        </w:numPr>
         <w:bidi/>
       </w:pPr>
       <w:r>
@@ -1043,7 +775,7 @@
           <w:szCs w:val="21"/>
           <w:rtl/>
         </w:rPr>
-        <w:t xml:space="preserve">نکته:</w:t>
+        <w:t xml:space="preserve">سال مالی:</w:t>
       </w:r>
       <w:r>
         <w:rPr>
@@ -1061,9 +793,690 @@
           <w:szCs w:val="21"/>
           <w:rtl/>
         </w:rPr>
-        <w:t xml:space="preserve">معیار قبلی «حضور پیوسته در کل دوره» برای ۲۴ سال نمونه را خیلی کوچک می‌کند و سوگیری بقا ایجاد می‌کند. پنل نامتوازن با حداقل ۶ سال پیاپی، روش استاندارد پژوهش‌های بین‌المللی است.</w:t>
+        <w:t xml:space="preserve">همه‌ی شرکت‌ها سال مالی منتهی به اسفند دارند. این به‌عنوان ویژگی نمونه در متن نوشته می‌شود، نه به‌عنوان مرحله‌ی حذف.</w:t>
       </w:r>
     </w:p>
+    <w:p>
+      <w:pPr>
+        <w:pStyle w:val="Compact"/>
+        <w:numPr>
+          <w:ilvl w:val="0"/>
+          <w:numId w:val="1003"/>
+        </w:numPr>
+        <w:bidi/>
+      </w:pPr>
+      <w:r>
+        <w:rPr>
+          <w:rFonts w:ascii="Tahoma" w:hAnsi="Tahoma" w:cs="Tahoma"/>
+          <w:b/>
+          <w:bCs/>
+          <w:sz w:val="21"/>
+          <w:szCs w:val="21"/>
+          <w:rtl/>
+        </w:rPr>
+        <w:t xml:space="preserve">حداقل تعداد سال:</w:t>
+      </w:r>
+      <w:r>
+        <w:rPr>
+          <w:rFonts w:ascii="Tahoma" w:hAnsi="Tahoma" w:cs="Tahoma"/>
+          <w:sz w:val="21"/>
+          <w:szCs w:val="21"/>
+          <w:rtl/>
+        </w:rPr>
+        <w:t xml:space="preserve"> </w:t>
+      </w:r>
+      <w:r>
+        <w:rPr>
+          <w:rFonts w:ascii="Tahoma" w:hAnsi="Tahoma" w:cs="Tahoma"/>
+          <w:sz w:val="21"/>
+          <w:szCs w:val="21"/>
+          <w:rtl/>
+        </w:rPr>
+        <w:t xml:space="preserve">هیچ حداقلی اعمال نمی‌شود. هر سال-شرکتی که داده‌ی سال‌های قبل (وقفه‌ها) را داشته باشد، خودکار وارد برآورد می‌شود. شرکتی که سابقه‌ی کوتاهی دارد، فقط به‌اندازه‌ی داده‌اش مشارکت می‌کند. این قاعده به داده تعیین می‌شود، نه به انتخاب پژوهشگر، و داور آن را به‌راحتی می‌پذیرد.</w:t>
+      </w:r>
+    </w:p>
+    <w:p>
+      <w:pPr>
+        <w:pStyle w:val="Compact"/>
+        <w:numPr>
+          <w:ilvl w:val="0"/>
+          <w:numId w:val="1003"/>
+        </w:numPr>
+        <w:bidi/>
+      </w:pPr>
+      <w:r>
+        <w:rPr>
+          <w:rFonts w:ascii="Tahoma" w:hAnsi="Tahoma" w:cs="Tahoma"/>
+          <w:b/>
+          <w:bCs/>
+          <w:sz w:val="21"/>
+          <w:szCs w:val="21"/>
+          <w:rtl/>
+        </w:rPr>
+        <w:t xml:space="preserve">حقوق صاحبان سهام صفر یا منفی:</w:t>
+      </w:r>
+      <w:r>
+        <w:rPr>
+          <w:rFonts w:ascii="Tahoma" w:hAnsi="Tahoma" w:cs="Tahoma"/>
+          <w:sz w:val="21"/>
+          <w:szCs w:val="21"/>
+          <w:rtl/>
+        </w:rPr>
+        <w:t xml:space="preserve"> </w:t>
+      </w:r>
+      <w:r>
+        <w:rPr>
+          <w:rFonts w:ascii="Tahoma" w:hAnsi="Tahoma" w:cs="Tahoma"/>
+          <w:sz w:val="21"/>
+          <w:szCs w:val="21"/>
+          <w:rtl/>
+        </w:rPr>
+        <w:t xml:space="preserve">کد Stata حذف می‌کند و تعداد را در برگه‌ی</w:t>
+      </w:r>
+      <w:r>
+        <w:rPr>
+          <w:rFonts w:ascii="Tahoma" w:hAnsi="Tahoma" w:cs="Tahoma"/>
+          <w:sz w:val="21"/>
+          <w:szCs w:val="21"/>
+          <w:rtl/>
+        </w:rPr>
+        <w:t xml:space="preserve"> </w:t>
+      </w:r>
+      <w:r>
+        <w:rPr>
+          <w:rStyle w:val="VerbatimChar"/>
+          <w:rFonts w:ascii="Tahoma" w:hAnsi="Tahoma" w:cs="Tahoma"/>
+          <w:sz w:val="21"/>
+          <w:szCs w:val="21"/>
+          <w:rtl/>
+        </w:rPr>
+        <w:t xml:space="preserve">T0_sample</w:t>
+      </w:r>
+      <w:r>
+        <w:rPr>
+          <w:rFonts w:ascii="Tahoma" w:hAnsi="Tahoma" w:cs="Tahoma"/>
+          <w:sz w:val="21"/>
+          <w:szCs w:val="21"/>
+          <w:rtl/>
+        </w:rPr>
+        <w:t xml:space="preserve"> </w:t>
+      </w:r>
+      <w:r>
+        <w:rPr>
+          <w:rFonts w:ascii="Tahoma" w:hAnsi="Tahoma" w:cs="Tahoma"/>
+          <w:sz w:val="21"/>
+          <w:szCs w:val="21"/>
+          <w:rtl/>
+        </w:rPr>
+        <w:t xml:space="preserve">فایل Tables.xlsx می‌نویسد.</w:t>
+      </w:r>
+    </w:p>
+    <w:p>
+      <w:pPr>
+        <w:pStyle w:val="Compact"/>
+        <w:numPr>
+          <w:ilvl w:val="0"/>
+          <w:numId w:val="1003"/>
+        </w:numPr>
+        <w:bidi/>
+      </w:pPr>
+      <w:r>
+        <w:rPr>
+          <w:rFonts w:ascii="Tahoma" w:hAnsi="Tahoma" w:cs="Tahoma"/>
+          <w:b/>
+          <w:bCs/>
+          <w:sz w:val="21"/>
+          <w:szCs w:val="21"/>
+          <w:rtl/>
+        </w:rPr>
+        <w:t xml:space="preserve">توقف نماد:</w:t>
+      </w:r>
+      <w:r>
+        <w:rPr>
+          <w:rFonts w:ascii="Tahoma" w:hAnsi="Tahoma" w:cs="Tahoma"/>
+          <w:sz w:val="21"/>
+          <w:szCs w:val="21"/>
+          <w:rtl/>
+        </w:rPr>
+        <w:t xml:space="preserve"> </w:t>
+      </w:r>
+      <w:r>
+        <w:rPr>
+          <w:rFonts w:ascii="Tahoma" w:hAnsi="Tahoma" w:cs="Tahoma"/>
+          <w:sz w:val="21"/>
+          <w:szCs w:val="21"/>
+          <w:rtl/>
+        </w:rPr>
+        <w:t xml:space="preserve">داده‌اش در دسترس نیست و اعمال نمی‌شود. ارزش بازار پایان سال برای نماد متوقف همان آخرین قیمت است؛ در بخش محدودیت‌ها یک جمله می‌آید.</w:t>
+      </w:r>
+    </w:p>
+    <w:p>
+      <w:pPr>
+        <w:bidi/>
+      </w:pPr>
+      <w:r>
+        <w:rPr>
+          <w:rFonts w:ascii="Tahoma" w:hAnsi="Tahoma" w:cs="Tahoma"/>
+          <w:b/>
+          <w:bCs/>
+          <w:sz w:val="21"/>
+          <w:szCs w:val="21"/>
+          <w:rtl/>
+        </w:rPr>
+        <w:t xml:space="preserve">جدول نمونه‌ی مقاله</w:t>
+      </w:r>
+      <w:r>
+        <w:rPr>
+          <w:rFonts w:ascii="Tahoma" w:hAnsi="Tahoma" w:cs="Tahoma"/>
+          <w:sz w:val="21"/>
+          <w:szCs w:val="21"/>
+          <w:rtl/>
+        </w:rPr>
+        <w:t xml:space="preserve"> </w:t>
+      </w:r>
+      <w:r>
+        <w:rPr>
+          <w:rFonts w:ascii="Tahoma" w:hAnsi="Tahoma" w:cs="Tahoma"/>
+          <w:sz w:val="21"/>
+          <w:szCs w:val="21"/>
+          <w:rtl/>
+        </w:rPr>
+        <w:t xml:space="preserve">از ترکیب یادداشت‌های شما (ردیف‌های ۱ تا ۳) و برگه‌ی</w:t>
+      </w:r>
+      <w:r>
+        <w:rPr>
+          <w:rFonts w:ascii="Tahoma" w:hAnsi="Tahoma" w:cs="Tahoma"/>
+          <w:sz w:val="21"/>
+          <w:szCs w:val="21"/>
+          <w:rtl/>
+        </w:rPr>
+        <w:t xml:space="preserve"> </w:t>
+      </w:r>
+      <w:r>
+        <w:rPr>
+          <w:rStyle w:val="VerbatimChar"/>
+          <w:rFonts w:ascii="Tahoma" w:hAnsi="Tahoma" w:cs="Tahoma"/>
+          <w:sz w:val="21"/>
+          <w:szCs w:val="21"/>
+          <w:rtl/>
+        </w:rPr>
+        <w:t xml:space="preserve">T0_sample</w:t>
+      </w:r>
+      <w:r>
+        <w:rPr>
+          <w:rFonts w:ascii="Tahoma" w:hAnsi="Tahoma" w:cs="Tahoma"/>
+          <w:sz w:val="21"/>
+          <w:szCs w:val="21"/>
+          <w:rtl/>
+        </w:rPr>
+        <w:t xml:space="preserve"> </w:t>
+      </w:r>
+      <w:r>
+        <w:rPr>
+          <w:rFonts w:ascii="Tahoma" w:hAnsi="Tahoma" w:cs="Tahoma"/>
+          <w:sz w:val="21"/>
+          <w:szCs w:val="21"/>
+          <w:rtl/>
+        </w:rPr>
+        <w:t xml:space="preserve">(بقیه‌ی ردیف‌ها) ساخته می‌شود:</w:t>
+      </w:r>
+    </w:p>
+    <w:tbl>
+      <w:tblPr>
+        <w:tblStyle w:val="Table"/>
+        <w:bidiVisual/>
+        <w:tblW w:type="auto" w:w="0"/>
+        <w:tblBorders>
+          <w:top w:val="single" w:sz="4" w:space="0" w:color="808080"/>
+          <w:left w:val="single" w:sz="4" w:space="0" w:color="808080"/>
+          <w:bottom w:val="single" w:sz="4" w:space="0" w:color="808080"/>
+          <w:right w:val="single" w:sz="4" w:space="0" w:color="808080"/>
+          <w:insideH w:val="single" w:sz="4" w:space="0" w:color="808080"/>
+          <w:insideV w:val="single" w:sz="4" w:space="0" w:color="808080"/>
+        </w:tblBorders>
+        <w:tblLook w:firstRow="1" w:lastRow="0" w:firstColumn="0" w:lastColumn="0" w:noHBand="0" w:noVBand="0" w:val="0020"/>
+      </w:tblPr>
+      <w:tblGrid>
+        <w:gridCol w:w="1980"/>
+        <w:gridCol w:w="1980"/>
+        <w:gridCol w:w="1980"/>
+        <w:gridCol w:w="1980"/>
+      </w:tblGrid>
+      <w:tr>
+        <w:trPr>
+          <w:tblHeader w:val="on"/>
+        </w:trPr>
+        <w:tc>
+          <w:tcPr>
+            <w:shd w:val="clear" w:color="auto" w:fill="E8ECF3"/>
+          </w:tcPr>
+          <w:p>
+            <w:pPr>
+              <w:pStyle w:val="Compact"/>
+              <w:bidi/>
+            </w:pPr>
+            <w:r>
+              <w:rPr>
+                <w:rFonts w:ascii="Tahoma" w:hAnsi="Tahoma" w:cs="Tahoma"/>
+                <w:b/>
+                <w:sz w:val="21"/>
+                <w:szCs w:val="21"/>
+                <w:rtl/>
+              </w:rPr>
+              <w:t xml:space="preserve">مرحله</w:t>
+            </w:r>
+          </w:p>
+        </w:tc>
+        <w:tc>
+          <w:tcPr>
+            <w:shd w:val="clear" w:color="auto" w:fill="E8ECF3"/>
+          </w:tcPr>
+          <w:p>
+            <w:pPr>
+              <w:pStyle w:val="Compact"/>
+              <w:bidi/>
+            </w:pPr>
+            <w:r>
+              <w:rPr>
+                <w:rFonts w:ascii="Tahoma" w:hAnsi="Tahoma" w:cs="Tahoma"/>
+                <w:b/>
+                <w:sz w:val="21"/>
+                <w:szCs w:val="21"/>
+                <w:rtl/>
+              </w:rPr>
+              <w:t xml:space="preserve">شرکت</w:t>
+            </w:r>
+          </w:p>
+        </w:tc>
+        <w:tc>
+          <w:tcPr>
+            <w:shd w:val="clear" w:color="auto" w:fill="E8ECF3"/>
+          </w:tcPr>
+          <w:p>
+            <w:pPr>
+              <w:pStyle w:val="Compact"/>
+              <w:bidi/>
+            </w:pPr>
+            <w:r>
+              <w:rPr>
+                <w:rFonts w:ascii="Tahoma" w:hAnsi="Tahoma" w:cs="Tahoma"/>
+                <w:b/>
+                <w:sz w:val="21"/>
+                <w:szCs w:val="21"/>
+                <w:rtl/>
+              </w:rPr>
+              <w:t xml:space="preserve">سال-شرکت</w:t>
+            </w:r>
+          </w:p>
+        </w:tc>
+        <w:tc>
+          <w:tcPr>
+            <w:shd w:val="clear" w:color="auto" w:fill="E8ECF3"/>
+          </w:tcPr>
+          <w:p>
+            <w:pPr>
+              <w:pStyle w:val="Compact"/>
+              <w:bidi/>
+            </w:pPr>
+            <w:r>
+              <w:rPr>
+                <w:rFonts w:ascii="Tahoma" w:hAnsi="Tahoma" w:cs="Tahoma"/>
+                <w:b/>
+                <w:sz w:val="21"/>
+                <w:szCs w:val="21"/>
+                <w:rtl/>
+              </w:rPr>
+              <w:t xml:space="preserve">منبع عدد</w:t>
+            </w:r>
+          </w:p>
+        </w:tc>
+      </w:tr>
+      <w:tr>
+        <w:tc>
+          <w:tcPr/>
+          <w:p>
+            <w:pPr>
+              <w:pStyle w:val="Compact"/>
+              <w:bidi/>
+            </w:pPr>
+            <w:r>
+              <w:rPr>
+                <w:rFonts w:ascii="Tahoma" w:hAnsi="Tahoma" w:cs="Tahoma"/>
+                <w:sz w:val="21"/>
+                <w:szCs w:val="21"/>
+                <w:rtl/>
+              </w:rPr>
+              <w:t xml:space="preserve">شرکت‌های بورس تهران، ۱۳۸۰–۱۴۰۳</w:t>
+            </w:r>
+          </w:p>
+        </w:tc>
+        <w:tc>
+          <w:tcPr/>
+          <w:p>
+            <w:pPr>
+              <w:pStyle w:val="Compact"/>
+              <w:bidi/>
+            </w:pPr>
+          </w:p>
+        </w:tc>
+        <w:tc>
+          <w:tcPr/>
+          <w:p>
+            <w:pPr>
+              <w:pStyle w:val="Compact"/>
+              <w:bidi/>
+            </w:pPr>
+          </w:p>
+        </w:tc>
+        <w:tc>
+          <w:tcPr/>
+          <w:p>
+            <w:pPr>
+              <w:pStyle w:val="Compact"/>
+              <w:bidi/>
+            </w:pPr>
+            <w:r>
+              <w:rPr>
+                <w:rFonts w:ascii="Tahoma" w:hAnsi="Tahoma" w:cs="Tahoma"/>
+                <w:sz w:val="21"/>
+                <w:szCs w:val="21"/>
+                <w:rtl/>
+              </w:rPr>
+              <w:t xml:space="preserve">یادداشت شما</w:t>
+            </w:r>
+          </w:p>
+        </w:tc>
+      </w:tr>
+      <w:tr>
+        <w:tc>
+          <w:tcPr/>
+          <w:p>
+            <w:pPr>
+              <w:pStyle w:val="Compact"/>
+              <w:bidi/>
+            </w:pPr>
+            <w:r>
+              <w:rPr>
+                <w:rFonts w:ascii="Tahoma" w:hAnsi="Tahoma" w:cs="Tahoma"/>
+                <w:sz w:val="21"/>
+                <w:szCs w:val="21"/>
+                <w:rtl/>
+              </w:rPr>
+              <w:t xml:space="preserve">منهای سال-شرکت‌های فرابورس</w:t>
+            </w:r>
+          </w:p>
+        </w:tc>
+        <w:tc>
+          <w:tcPr/>
+          <w:p>
+            <w:pPr>
+              <w:pStyle w:val="Compact"/>
+              <w:bidi/>
+            </w:pPr>
+          </w:p>
+        </w:tc>
+        <w:tc>
+          <w:tcPr/>
+          <w:p>
+            <w:pPr>
+              <w:pStyle w:val="Compact"/>
+              <w:bidi/>
+            </w:pPr>
+          </w:p>
+        </w:tc>
+        <w:tc>
+          <w:tcPr/>
+          <w:p>
+            <w:pPr>
+              <w:pStyle w:val="Compact"/>
+              <w:bidi/>
+            </w:pPr>
+            <w:r>
+              <w:rPr>
+                <w:rFonts w:ascii="Tahoma" w:hAnsi="Tahoma" w:cs="Tahoma"/>
+                <w:sz w:val="21"/>
+                <w:szCs w:val="21"/>
+                <w:rtl/>
+              </w:rPr>
+              <w:t xml:space="preserve">یادداشت شما</w:t>
+            </w:r>
+          </w:p>
+        </w:tc>
+      </w:tr>
+      <w:tr>
+        <w:tc>
+          <w:tcPr/>
+          <w:p>
+            <w:pPr>
+              <w:pStyle w:val="Compact"/>
+              <w:bidi/>
+            </w:pPr>
+            <w:r>
+              <w:rPr>
+                <w:rFonts w:ascii="Tahoma" w:hAnsi="Tahoma" w:cs="Tahoma"/>
+                <w:sz w:val="21"/>
+                <w:szCs w:val="21"/>
+                <w:rtl/>
+              </w:rPr>
+              <w:t xml:space="preserve">منهای شرکت‌های مالی، سرمایه‌گذاری، هلدینگ و لیزینگ</w:t>
+            </w:r>
+          </w:p>
+        </w:tc>
+        <w:tc>
+          <w:tcPr/>
+          <w:p>
+            <w:pPr>
+              <w:pStyle w:val="Compact"/>
+              <w:bidi/>
+            </w:pPr>
+          </w:p>
+        </w:tc>
+        <w:tc>
+          <w:tcPr/>
+          <w:p>
+            <w:pPr>
+              <w:pStyle w:val="Compact"/>
+              <w:bidi/>
+            </w:pPr>
+          </w:p>
+        </w:tc>
+        <w:tc>
+          <w:tcPr/>
+          <w:p>
+            <w:pPr>
+              <w:pStyle w:val="Compact"/>
+              <w:bidi/>
+            </w:pPr>
+            <w:r>
+              <w:rPr>
+                <w:rFonts w:ascii="Tahoma" w:hAnsi="Tahoma" w:cs="Tahoma"/>
+                <w:sz w:val="21"/>
+                <w:szCs w:val="21"/>
+                <w:rtl/>
+              </w:rPr>
+              <w:t xml:space="preserve">یادداشت شما</w:t>
+            </w:r>
+          </w:p>
+        </w:tc>
+      </w:tr>
+      <w:tr>
+        <w:tc>
+          <w:tcPr/>
+          <w:p>
+            <w:pPr>
+              <w:pStyle w:val="Compact"/>
+              <w:bidi/>
+            </w:pPr>
+            <w:r>
+              <w:rPr>
+                <w:rFonts w:ascii="Tahoma" w:hAnsi="Tahoma" w:cs="Tahoma"/>
+                <w:sz w:val="21"/>
+                <w:szCs w:val="21"/>
+                <w:rtl/>
+              </w:rPr>
+              <w:t xml:space="preserve">منهای حقوق صاحبان سهام ≤ ۰</w:t>
+            </w:r>
+          </w:p>
+        </w:tc>
+        <w:tc>
+          <w:tcPr/>
+          <w:p>
+            <w:pPr>
+              <w:pStyle w:val="Compact"/>
+              <w:bidi/>
+            </w:pPr>
+            <w:r>
+              <w:rPr>
+                <w:rFonts w:ascii="Tahoma" w:hAnsi="Tahoma" w:cs="Tahoma"/>
+                <w:sz w:val="21"/>
+                <w:szCs w:val="21"/>
+                <w:rtl/>
+              </w:rPr>
+              <w:t xml:space="preserve">—</w:t>
+            </w:r>
+          </w:p>
+        </w:tc>
+        <w:tc>
+          <w:tcPr/>
+          <w:p>
+            <w:pPr>
+              <w:pStyle w:val="Compact"/>
+              <w:bidi/>
+            </w:pPr>
+          </w:p>
+        </w:tc>
+        <w:tc>
+          <w:tcPr/>
+          <w:p>
+            <w:pPr>
+              <w:pStyle w:val="Compact"/>
+              <w:bidi/>
+            </w:pPr>
+            <w:r>
+              <w:rPr>
+                <w:rFonts w:ascii="Tahoma" w:hAnsi="Tahoma" w:cs="Tahoma"/>
+                <w:sz w:val="21"/>
+                <w:szCs w:val="21"/>
+                <w:rtl/>
+              </w:rPr>
+              <w:t xml:space="preserve">T0_sample</w:t>
+            </w:r>
+          </w:p>
+        </w:tc>
+      </w:tr>
+      <w:tr>
+        <w:tc>
+          <w:tcPr/>
+          <w:p>
+            <w:pPr>
+              <w:pStyle w:val="Compact"/>
+              <w:bidi/>
+            </w:pPr>
+            <w:r>
+              <w:rPr>
+                <w:rFonts w:ascii="Tahoma" w:hAnsi="Tahoma" w:cs="Tahoma"/>
+                <w:sz w:val="21"/>
+                <w:szCs w:val="21"/>
+                <w:rtl/>
+              </w:rPr>
+              <w:t xml:space="preserve">پنل نهایی (با سال پایه)</w:t>
+            </w:r>
+          </w:p>
+        </w:tc>
+        <w:tc>
+          <w:tcPr/>
+          <w:p>
+            <w:pPr>
+              <w:pStyle w:val="Compact"/>
+              <w:bidi/>
+            </w:pPr>
+          </w:p>
+        </w:tc>
+        <w:tc>
+          <w:tcPr/>
+          <w:p>
+            <w:pPr>
+              <w:pStyle w:val="Compact"/>
+              <w:bidi/>
+            </w:pPr>
+          </w:p>
+        </w:tc>
+        <w:tc>
+          <w:tcPr/>
+          <w:p>
+            <w:pPr>
+              <w:pStyle w:val="Compact"/>
+              <w:bidi/>
+            </w:pPr>
+            <w:r>
+              <w:rPr>
+                <w:rFonts w:ascii="Tahoma" w:hAnsi="Tahoma" w:cs="Tahoma"/>
+                <w:sz w:val="21"/>
+                <w:szCs w:val="21"/>
+                <w:rtl/>
+              </w:rPr>
+              <w:t xml:space="preserve">T0_sample</w:t>
+            </w:r>
+          </w:p>
+        </w:tc>
+      </w:tr>
+      <w:tr>
+        <w:tc>
+          <w:tcPr/>
+          <w:p>
+            <w:pPr>
+              <w:pStyle w:val="Compact"/>
+              <w:bidi/>
+            </w:pPr>
+            <w:r>
+              <w:rPr>
+                <w:rFonts w:ascii="Tahoma" w:hAnsi="Tahoma" w:cs="Tahoma"/>
+                <w:sz w:val="21"/>
+                <w:szCs w:val="21"/>
+                <w:rtl/>
+              </w:rPr>
+              <w:t xml:space="preserve">نمونه‌ی برآورد GMM (وقفه‌ها موجود)</w:t>
+            </w:r>
+          </w:p>
+        </w:tc>
+        <w:tc>
+          <w:tcPr/>
+          <w:p>
+            <w:pPr>
+              <w:pStyle w:val="Compact"/>
+              <w:bidi/>
+            </w:pPr>
+          </w:p>
+        </w:tc>
+        <w:tc>
+          <w:tcPr/>
+          <w:p>
+            <w:pPr>
+              <w:pStyle w:val="Compact"/>
+              <w:bidi/>
+            </w:pPr>
+          </w:p>
+        </w:tc>
+        <w:tc>
+          <w:tcPr/>
+          <w:p>
+            <w:pPr>
+              <w:pStyle w:val="Compact"/>
+              <w:bidi/>
+            </w:pPr>
+            <w:r>
+              <w:rPr>
+                <w:rFonts w:ascii="Tahoma" w:hAnsi="Tahoma" w:cs="Tahoma"/>
+                <w:sz w:val="21"/>
+                <w:szCs w:val="21"/>
+                <w:rtl/>
+              </w:rPr>
+              <w:t xml:space="preserve">T0_sample</w:t>
+            </w:r>
+          </w:p>
+        </w:tc>
+      </w:tr>
+    </w:tbl>
     <w:bookmarkEnd w:id="10"/>
     <w:bookmarkStart w:id="11" w:name="ساختار-فایل"/>
     <w:p>
@@ -1437,7 +1850,7 @@
         <w:pStyle w:val="Compact"/>
         <w:numPr>
           <w:ilvl w:val="0"/>
-          <w:numId w:val="1003"/>
+          <w:numId w:val="1004"/>
         </w:numPr>
         <w:bidi/>
       </w:pPr>
@@ -1476,7 +1889,7 @@
         <w:pStyle w:val="Compact"/>
         <w:numPr>
           <w:ilvl w:val="0"/>
-          <w:numId w:val="1003"/>
+          <w:numId w:val="1004"/>
         </w:numPr>
         <w:bidi/>
       </w:pPr>
@@ -1515,7 +1928,7 @@
         <w:pStyle w:val="Compact"/>
         <w:numPr>
           <w:ilvl w:val="0"/>
-          <w:numId w:val="1003"/>
+          <w:numId w:val="1004"/>
         </w:numPr>
         <w:bidi/>
       </w:pPr>
@@ -1554,7 +1967,7 @@
         <w:pStyle w:val="Compact"/>
         <w:numPr>
           <w:ilvl w:val="0"/>
-          <w:numId w:val="1003"/>
+          <w:numId w:val="1004"/>
         </w:numPr>
         <w:bidi/>
       </w:pPr>
@@ -1584,7 +1997,7 @@
         <w:pStyle w:val="Compact"/>
         <w:numPr>
           <w:ilvl w:val="0"/>
-          <w:numId w:val="1003"/>
+          <w:numId w:val="1004"/>
         </w:numPr>
         <w:bidi/>
       </w:pPr>
@@ -1623,7 +2036,7 @@
         <w:pStyle w:val="Compact"/>
         <w:numPr>
           <w:ilvl w:val="0"/>
-          <w:numId w:val="1003"/>
+          <w:numId w:val="1004"/>
         </w:numPr>
         <w:bidi/>
       </w:pPr>
@@ -4164,7 +4577,7 @@
         <w:pStyle w:val="Compact"/>
         <w:numPr>
           <w:ilvl w:val="0"/>
-          <w:numId w:val="1004"/>
+          <w:numId w:val="1005"/>
         </w:numPr>
         <w:bidi/>
       </w:pPr>
@@ -4183,7 +4596,7 @@
         <w:pStyle w:val="Compact"/>
         <w:numPr>
           <w:ilvl w:val="0"/>
-          <w:numId w:val="1004"/>
+          <w:numId w:val="1005"/>
         </w:numPr>
         <w:bidi/>
       </w:pPr>
@@ -4202,7 +4615,7 @@
         <w:pStyle w:val="Compact"/>
         <w:numPr>
           <w:ilvl w:val="0"/>
-          <w:numId w:val="1004"/>
+          <w:numId w:val="1005"/>
         </w:numPr>
         <w:bidi/>
       </w:pPr>
@@ -4221,7 +4634,7 @@
         <w:pStyle w:val="Compact"/>
         <w:numPr>
           <w:ilvl w:val="0"/>
-          <w:numId w:val="1004"/>
+          <w:numId w:val="1005"/>
         </w:numPr>
         <w:bidi/>
       </w:pPr>
@@ -4240,7 +4653,7 @@
         <w:pStyle w:val="Compact"/>
         <w:numPr>
           <w:ilvl w:val="0"/>
-          <w:numId w:val="1004"/>
+          <w:numId w:val="1005"/>
         </w:numPr>
         <w:bidi/>
       </w:pPr>
@@ -4259,7 +4672,7 @@
         <w:pStyle w:val="Compact"/>
         <w:numPr>
           <w:ilvl w:val="0"/>
-          <w:numId w:val="1004"/>
+          <w:numId w:val="1005"/>
         </w:numPr>
         <w:bidi/>
       </w:pPr>
@@ -4278,7 +4691,7 @@
         <w:pStyle w:val="Compact"/>
         <w:numPr>
           <w:ilvl w:val="0"/>
-          <w:numId w:val="1004"/>
+          <w:numId w:val="1005"/>
         </w:numPr>
         <w:bidi/>
       </w:pPr>
@@ -4289,7 +4702,7 @@
           <w:szCs w:val="21"/>
           <w:rtl/>
         </w:rPr>
-        <w:t xml:space="preserve">تعداد شرکت و سال-شرکت حذف‌شده در هر مرحله‌ی غربالگری را در یک برگه‌ی جداگانه با نام «Screening» بنویسید.</w:t>
+        <w:t xml:space="preserve">تعداد شرکت و سال-شرکت حذف‌شده در سه مرحله‌ی غربالگری دستی را یادداشت کنید.</w:t>
       </w:r>
     </w:p>
     <w:p>
@@ -4297,7 +4710,7 @@
         <w:pStyle w:val="Compact"/>
         <w:numPr>
           <w:ilvl w:val="0"/>
-          <w:numId w:val="1004"/>
+          <w:numId w:val="1005"/>
         </w:numPr>
         <w:bidi/>
       </w:pPr>
@@ -4826,6 +5239,9 @@
     <w:abstractNumId w:val="991"/>
   </w:num>
   <w:num w:numId="1004">
+    <w:abstractNumId w:val="991"/>
+  </w:num>
+  <w:num w:numId="1005">
     <w:abstractNumId w:val="99411"/>
     <w:lvlOverride w:ilvl="0">
       <w:startOverride w:val="1"/>

</xml_diff>

<commit_message>
Automatic sample screening (05_screening.do) with screening table and check lists
Co-Authored-By: Claude Opus 5.5 <noreply@anthropic.com>
Claude-Session: https://claude.ai/code/session_019etBaQcYpfE848z3Ex8rct
</commit_message>
<xml_diff>
--- a/docs/Data_Collection_Guide.docx
+++ b/docs/Data_Collection_Guide.docx
@@ -272,7 +272,7 @@
       </w:r>
     </w:p>
     <w:bookmarkEnd w:id="9"/>
-    <w:bookmarkStart w:id="10" w:name="غربالگری-شرکتها"/>
+    <w:bookmarkStart w:id="10" w:name="غربالگری-شرکتها-خودکار-در-stata"/>
     <w:p>
       <w:pPr>
         <w:pStyle w:val="Heading1"/>
@@ -285,7 +285,7 @@
           <w:szCs w:val="21"/>
           <w:rtl/>
         </w:rPr>
-        <w:t xml:space="preserve">۲. غربالگری شرکت‌ها</w:t>
+        <w:t xml:space="preserve">۲. غربالگری شرکت‌ها: خودکار در Stata</w:t>
       </w:r>
     </w:p>
     <w:p>
@@ -299,7 +299,7 @@
           <w:szCs w:val="21"/>
           <w:rtl/>
         </w:rPr>
-        <w:t xml:space="preserve">غربالگری دستی (در اکسل) فقط سه مرحله است.</w:t>
+        <w:t xml:space="preserve">غربالگری را</w:t>
       </w:r>
       <w:r>
         <w:rPr>
@@ -319,16 +319,91 @@
           <w:szCs w:val="21"/>
           <w:rtl/>
         </w:rPr>
-        <w:t xml:space="preserve">تعداد شرکت‌ها و سال-شرکت‌های حذف‌شده در هر مرحله را یادداشت کنید</w:t>
-      </w:r>
-      <w:r>
-        <w:rPr>
-          <w:rFonts w:ascii="Tahoma" w:hAnsi="Tahoma" w:cs="Tahoma"/>
-          <w:sz w:val="21"/>
-          <w:szCs w:val="21"/>
-          <w:rtl/>
-        </w:rPr>
-        <w:t xml:space="preserve">؛ این اعداد مستقیماً در جدول نمونه‌ی مقاله (بخش 3.1) می‌آیند.</w:t>
+        <w:t xml:space="preserve">کد انجام می‌دهد</w:t>
+      </w:r>
+      <w:r>
+        <w:rPr>
+          <w:rFonts w:ascii="Tahoma" w:hAnsi="Tahoma" w:cs="Tahoma"/>
+          <w:sz w:val="21"/>
+          <w:szCs w:val="21"/>
+          <w:rtl/>
+        </w:rPr>
+        <w:t xml:space="preserve"> </w:t>
+      </w:r>
+      <w:r>
+        <w:rPr>
+          <w:rFonts w:ascii="Tahoma" w:hAnsi="Tahoma" w:cs="Tahoma"/>
+          <w:sz w:val="21"/>
+          <w:szCs w:val="21"/>
+          <w:rtl/>
+        </w:rPr>
+        <w:t xml:space="preserve">(فایل</w:t>
+      </w:r>
+      <w:r>
+        <w:rPr>
+          <w:rFonts w:ascii="Tahoma" w:hAnsi="Tahoma" w:cs="Tahoma"/>
+          <w:sz w:val="21"/>
+          <w:szCs w:val="21"/>
+          <w:rtl/>
+        </w:rPr>
+        <w:t xml:space="preserve"> </w:t>
+      </w:r>
+      <w:r>
+        <w:rPr>
+          <w:rStyle w:val="VerbatimChar"/>
+          <w:rFonts w:ascii="Tahoma" w:hAnsi="Tahoma" w:cs="Tahoma"/>
+          <w:sz w:val="21"/>
+          <w:szCs w:val="21"/>
+          <w:rtl/>
+        </w:rPr>
+        <w:t xml:space="preserve">05_screening.do</w:t>
+      </w:r>
+      <w:r>
+        <w:rPr>
+          <w:rFonts w:ascii="Tahoma" w:hAnsi="Tahoma" w:cs="Tahoma"/>
+          <w:sz w:val="21"/>
+          <w:szCs w:val="21"/>
+          <w:rtl/>
+        </w:rPr>
+        <w:t xml:space="preserve">). شما فقط</w:t>
+      </w:r>
+      <w:r>
+        <w:rPr>
+          <w:rFonts w:ascii="Tahoma" w:hAnsi="Tahoma" w:cs="Tahoma"/>
+          <w:sz w:val="21"/>
+          <w:szCs w:val="21"/>
+          <w:rtl/>
+        </w:rPr>
+        <w:t xml:space="preserve"> </w:t>
+      </w:r>
+      <w:r>
+        <w:rPr>
+          <w:rFonts w:ascii="Tahoma" w:hAnsi="Tahoma" w:cs="Tahoma"/>
+          <w:b/>
+          <w:bCs/>
+          <w:sz w:val="21"/>
+          <w:szCs w:val="21"/>
+          <w:rtl/>
+        </w:rPr>
+        <w:t xml:space="preserve">همه‌ی داده‌ها</w:t>
+      </w:r>
+      <w:r>
+        <w:rPr>
+          <w:rFonts w:ascii="Tahoma" w:hAnsi="Tahoma" w:cs="Tahoma"/>
+          <w:sz w:val="21"/>
+          <w:szCs w:val="21"/>
+          <w:rtl/>
+        </w:rPr>
+        <w:t xml:space="preserve"> </w:t>
+      </w:r>
+      <w:r>
+        <w:rPr>
+          <w:rFonts w:ascii="Tahoma" w:hAnsi="Tahoma" w:cs="Tahoma"/>
+          <w:sz w:val="21"/>
+          <w:szCs w:val="21"/>
+          <w:rtl/>
+        </w:rPr>
+        <w:t xml:space="preserve">را در یک فایل می‌ریزید: هر دو بازار (بورس و فرابورس) و همه‌ی صنایع، بدون حذف هیچ شرکتی.</w:t>
       </w:r>
     </w:p>
     <w:tbl>
@@ -394,7 +469,7 @@
                 <w:szCs w:val="21"/>
                 <w:rtl/>
               </w:rPr>
-              <w:t xml:space="preserve">معیار</w:t>
+              <w:t xml:space="preserve">کار کد</w:t>
             </w:r>
           </w:p>
         </w:tc>
@@ -453,139 +528,25 @@
                 <w:szCs w:val="21"/>
                 <w:rtl/>
               </w:rPr>
-              <w:t xml:space="preserve">همه‌ی شرکت‌هایی که در هر یک از سال‌های ۱۳۸۰ تا ۱۴۰۳ در</w:t>
-            </w:r>
-            <w:r>
-              <w:rPr>
-                <w:rFonts w:ascii="Tahoma" w:hAnsi="Tahoma" w:cs="Tahoma"/>
-                <w:sz w:val="21"/>
-                <w:szCs w:val="21"/>
-                <w:rtl/>
-              </w:rPr>
-              <w:t xml:space="preserve"> </w:t>
-            </w:r>
-            <w:r>
-              <w:rPr>
-                <w:rFonts w:ascii="Tahoma" w:hAnsi="Tahoma" w:cs="Tahoma"/>
-                <w:b/>
-                <w:bCs/>
-                <w:sz w:val="21"/>
-                <w:szCs w:val="21"/>
-                <w:rtl/>
-              </w:rPr>
-              <w:t xml:space="preserve">بورس اوراق بهادار تهران</w:t>
-            </w:r>
-            <w:r>
-              <w:rPr>
-                <w:rFonts w:ascii="Tahoma" w:hAnsi="Tahoma" w:cs="Tahoma"/>
-                <w:sz w:val="21"/>
-                <w:szCs w:val="21"/>
-                <w:rtl/>
-              </w:rPr>
-              <w:t xml:space="preserve"> </w:t>
-            </w:r>
-            <w:r>
-              <w:rPr>
-                <w:rFonts w:ascii="Tahoma" w:hAnsi="Tahoma" w:cs="Tahoma"/>
-                <w:sz w:val="21"/>
-                <w:szCs w:val="21"/>
-                <w:rtl/>
-              </w:rPr>
-              <w:t xml:space="preserve">بوده‌اند. شرکت‌هایی که</w:t>
-            </w:r>
-            <w:r>
-              <w:rPr>
-                <w:rFonts w:ascii="Tahoma" w:hAnsi="Tahoma" w:cs="Tahoma"/>
-                <w:sz w:val="21"/>
-                <w:szCs w:val="21"/>
-                <w:rtl/>
-              </w:rPr>
-              <w:t xml:space="preserve"> </w:t>
-            </w:r>
-            <w:r>
-              <w:rPr>
-                <w:rFonts w:ascii="Tahoma" w:hAnsi="Tahoma" w:cs="Tahoma"/>
-                <w:b/>
-                <w:bCs/>
-                <w:sz w:val="21"/>
-                <w:szCs w:val="21"/>
-                <w:rtl/>
-              </w:rPr>
-              <w:t xml:space="preserve">بعد از ۱۳۸۰ پذیرفته شده‌اند</w:t>
-            </w:r>
-            <w:r>
-              <w:rPr>
-                <w:rFonts w:ascii="Tahoma" w:hAnsi="Tahoma" w:cs="Tahoma"/>
-                <w:sz w:val="21"/>
-                <w:szCs w:val="21"/>
-                <w:rtl/>
-              </w:rPr>
-              <w:t xml:space="preserve"> </w:t>
-            </w:r>
-            <w:r>
-              <w:rPr>
-                <w:rFonts w:ascii="Tahoma" w:hAnsi="Tahoma" w:cs="Tahoma"/>
-                <w:sz w:val="21"/>
-                <w:szCs w:val="21"/>
-                <w:rtl/>
-              </w:rPr>
-              <w:t xml:space="preserve">از اولین سالی که داده دارند وارد می‌شوند. شرکت‌هایی که</w:t>
-            </w:r>
-            <w:r>
-              <w:rPr>
-                <w:rFonts w:ascii="Tahoma" w:hAnsi="Tahoma" w:cs="Tahoma"/>
-                <w:sz w:val="21"/>
-                <w:szCs w:val="21"/>
-                <w:rtl/>
-              </w:rPr>
-              <w:t xml:space="preserve"> </w:t>
-            </w:r>
-            <w:r>
-              <w:rPr>
-                <w:rFonts w:ascii="Tahoma" w:hAnsi="Tahoma" w:cs="Tahoma"/>
-                <w:b/>
-                <w:bCs/>
-                <w:sz w:val="21"/>
-                <w:szCs w:val="21"/>
-                <w:rtl/>
-              </w:rPr>
-              <w:t xml:space="preserve">بعداً از بورس خارج شده‌اند</w:t>
-            </w:r>
-            <w:r>
-              <w:rPr>
-                <w:rFonts w:ascii="Tahoma" w:hAnsi="Tahoma" w:cs="Tahoma"/>
-                <w:sz w:val="21"/>
-                <w:szCs w:val="21"/>
-                <w:rtl/>
-              </w:rPr>
-              <w:t xml:space="preserve"> </w:t>
-            </w:r>
-            <w:r>
-              <w:rPr>
-                <w:rFonts w:ascii="Tahoma" w:hAnsi="Tahoma" w:cs="Tahoma"/>
-                <w:sz w:val="21"/>
-                <w:szCs w:val="21"/>
-                <w:rtl/>
-              </w:rPr>
-              <w:t xml:space="preserve">حذف نمی‌شوند.</w:t>
-            </w:r>
-          </w:p>
-        </w:tc>
-        <w:tc>
-          <w:tcPr/>
-          <w:p>
-            <w:pPr>
-              <w:pStyle w:val="Compact"/>
-              <w:bidi/>
-            </w:pPr>
-            <w:r>
-              <w:rPr>
-                <w:rFonts w:ascii="Tahoma" w:hAnsi="Tahoma" w:cs="Tahoma"/>
-                <w:sz w:val="21"/>
-                <w:szCs w:val="21"/>
-                <w:rtl/>
-              </w:rPr>
-              <w:t xml:space="preserve">پنل نامتوازن؛ جلوگیری از سوگیری بقا</w:t>
+              <w:t xml:space="preserve">همه‌ی سال-شرکت‌های ۱۳۸۰ تا ۱۴۰۳؛ ردیف‌های تکراری (یک شرکت، یک سال) گزارش و حذف می‌شوند</w:t>
+            </w:r>
+          </w:p>
+        </w:tc>
+        <w:tc>
+          <w:tcPr/>
+          <w:p>
+            <w:pPr>
+              <w:pStyle w:val="Compact"/>
+              <w:bidi/>
+            </w:pPr>
+            <w:r>
+              <w:rPr>
+                <w:rFonts w:ascii="Tahoma" w:hAnsi="Tahoma" w:cs="Tahoma"/>
+                <w:sz w:val="21"/>
+                <w:szCs w:val="21"/>
+                <w:rtl/>
+              </w:rPr>
+              <w:t xml:space="preserve">شرکت‌هایی که دیرتر پذیرفته یا زودتر خارج شده‌اند هم می‌مانند (پنل نامتوازن؛ جلوگیری از سوگیری بقا)</w:t>
             </w:r>
           </w:p>
         </w:tc>
@@ -623,7 +584,7 @@
                 <w:szCs w:val="21"/>
                 <w:rtl/>
               </w:rPr>
-              <w:t xml:space="preserve">سال-شرکت‌های</w:t>
+              <w:t xml:space="preserve">حذف سال-شرکت‌های</w:t>
             </w:r>
             <w:r>
               <w:rPr>
@@ -661,25 +622,25 @@
                 <w:szCs w:val="21"/>
                 <w:rtl/>
               </w:rPr>
-              <w:t xml:space="preserve">حذف شوند (ستون «بازار»). اگر شرکتی از فرابورس به بورس منتقل شده، فقط سال‌های حضورش در بورس بماند.</w:t>
-            </w:r>
-          </w:p>
-        </w:tc>
-        <w:tc>
-          <w:tcPr/>
-          <w:p>
-            <w:pPr>
-              <w:pStyle w:val="Compact"/>
-              <w:bidi/>
-            </w:pPr>
-            <w:r>
-              <w:rPr>
-                <w:rFonts w:ascii="Tahoma" w:hAnsi="Tahoma" w:cs="Tahoma"/>
-                <w:sz w:val="21"/>
-                <w:szCs w:val="21"/>
-                <w:rtl/>
-              </w:rPr>
-              <w:t xml:space="preserve">نمونه، شرکت‌های بورس تهران است؛ شرایط پذیرش و اندازه‌ی شرکت‌های فرابورس متفاوت است</w:t>
+              <w:t xml:space="preserve">(ستون Market)</w:t>
+            </w:r>
+          </w:p>
+        </w:tc>
+        <w:tc>
+          <w:tcPr/>
+          <w:p>
+            <w:pPr>
+              <w:pStyle w:val="Compact"/>
+              <w:bidi/>
+            </w:pPr>
+            <w:r>
+              <w:rPr>
+                <w:rFonts w:ascii="Tahoma" w:hAnsi="Tahoma" w:cs="Tahoma"/>
+                <w:sz w:val="21"/>
+                <w:szCs w:val="21"/>
+                <w:rtl/>
+              </w:rPr>
+              <w:t xml:space="preserve">نمونه، شرکت‌های بورس تهران است</w:t>
             </w:r>
           </w:p>
         </w:tc>
@@ -717,7 +678,45 @@
                 <w:szCs w:val="21"/>
                 <w:rtl/>
               </w:rPr>
-              <w:t xml:space="preserve">حذف بانک‌ها، مؤسسات اعتباری، بیمه‌ها، لیزینگ‌ها، شرکت‌های سرمایه‌گذاری، هلدینگ‌ها، کارگزاری‌ها و صندوق‌ها</w:t>
+              <w:t xml:space="preserve">حذف</w:t>
+            </w:r>
+            <w:r>
+              <w:rPr>
+                <w:rFonts w:ascii="Tahoma" w:hAnsi="Tahoma" w:cs="Tahoma"/>
+                <w:sz w:val="21"/>
+                <w:szCs w:val="21"/>
+                <w:rtl/>
+              </w:rPr>
+              <w:t xml:space="preserve"> </w:t>
+            </w:r>
+            <w:r>
+              <w:rPr>
+                <w:rFonts w:ascii="Tahoma" w:hAnsi="Tahoma" w:cs="Tahoma"/>
+                <w:b/>
+                <w:bCs/>
+                <w:sz w:val="21"/>
+                <w:szCs w:val="21"/>
+                <w:rtl/>
+              </w:rPr>
+              <w:t xml:space="preserve">شرکت‌های مالی</w:t>
+            </w:r>
+            <w:r>
+              <w:rPr>
+                <w:rFonts w:ascii="Tahoma" w:hAnsi="Tahoma" w:cs="Tahoma"/>
+                <w:sz w:val="21"/>
+                <w:szCs w:val="21"/>
+                <w:rtl/>
+              </w:rPr>
+              <w:t xml:space="preserve"> </w:t>
+            </w:r>
+            <w:r>
+              <w:rPr>
+                <w:rFonts w:ascii="Tahoma" w:hAnsi="Tahoma" w:cs="Tahoma"/>
+                <w:sz w:val="21"/>
+                <w:szCs w:val="21"/>
+                <w:rtl/>
+              </w:rPr>
+              <w:t xml:space="preserve">از روی نام صنعت: بانک، بیمه، لیزینگ، سرمایه‌گذاری، هلدینگ و چندرشته‌ای، کارگزاری، صندوق، واسطه‌گری مالی، مؤسسات اعتباری، تأمین سرمایه</w:t>
             </w:r>
           </w:p>
         </w:tc>
@@ -736,27 +735,133 @@
                 <w:rtl/>
               </w:rPr>
               <w:t xml:space="preserve">ساختار سرمایه و دارایی‌های آن‌ها قابل مقایسه نیست</w:t>
+            </w:r>
+          </w:p>
+        </w:tc>
+      </w:tr>
+      <w:tr>
+        <w:tc>
+          <w:tcPr/>
+          <w:p>
+            <w:pPr>
+              <w:pStyle w:val="Compact"/>
+              <w:bidi/>
+            </w:pPr>
+            <w:r>
+              <w:rPr>
+                <w:rFonts w:ascii="Tahoma" w:hAnsi="Tahoma" w:cs="Tahoma"/>
+                <w:sz w:val="21"/>
+                <w:szCs w:val="21"/>
+                <w:rtl/>
+              </w:rPr>
+              <w:t xml:space="preserve">۴</w:t>
+            </w:r>
+          </w:p>
+        </w:tc>
+        <w:tc>
+          <w:tcPr/>
+          <w:p>
+            <w:pPr>
+              <w:pStyle w:val="Compact"/>
+              <w:bidi/>
+            </w:pPr>
+            <w:r>
+              <w:rPr>
+                <w:rFonts w:ascii="Tahoma" w:hAnsi="Tahoma" w:cs="Tahoma"/>
+                <w:sz w:val="21"/>
+                <w:szCs w:val="21"/>
+                <w:rtl/>
+              </w:rPr>
+              <w:t xml:space="preserve">حذف سال-شرکت‌های با</w:t>
+            </w:r>
+            <w:r>
+              <w:rPr>
+                <w:rFonts w:ascii="Tahoma" w:hAnsi="Tahoma" w:cs="Tahoma"/>
+                <w:sz w:val="21"/>
+                <w:szCs w:val="21"/>
+                <w:rtl/>
+              </w:rPr>
+              <w:t xml:space="preserve"> </w:t>
+            </w:r>
+            <w:r>
+              <w:rPr>
+                <w:rFonts w:ascii="Tahoma" w:hAnsi="Tahoma" w:cs="Tahoma"/>
+                <w:b/>
+                <w:bCs/>
+                <w:sz w:val="21"/>
+                <w:szCs w:val="21"/>
+                <w:rtl/>
+              </w:rPr>
+              <w:t xml:space="preserve">حقوق صاحبان سهام ≤ ۰</w:t>
+            </w:r>
+            <w:r>
+              <w:rPr>
+                <w:rFonts w:ascii="Tahoma" w:hAnsi="Tahoma" w:cs="Tahoma"/>
+                <w:sz w:val="21"/>
+                <w:szCs w:val="21"/>
+                <w:rtl/>
+              </w:rPr>
+              <w:t xml:space="preserve"> </w:t>
+            </w:r>
+            <w:r>
+              <w:rPr>
+                <w:rFonts w:ascii="Tahoma" w:hAnsi="Tahoma" w:cs="Tahoma"/>
+                <w:sz w:val="21"/>
+                <w:szCs w:val="21"/>
+                <w:rtl/>
+              </w:rPr>
+              <w:t xml:space="preserve">(در</w:t>
+            </w:r>
+            <w:r>
+              <w:rPr>
+                <w:rFonts w:ascii="Tahoma" w:hAnsi="Tahoma" w:cs="Tahoma"/>
+                <w:sz w:val="21"/>
+                <w:szCs w:val="21"/>
+                <w:rtl/>
+              </w:rPr>
+              <w:t xml:space="preserve"> </w:t>
+            </w:r>
+            <w:r>
+              <w:rPr>
+                <w:rStyle w:val="VerbatimChar"/>
+                <w:rFonts w:ascii="Tahoma" w:hAnsi="Tahoma" w:cs="Tahoma"/>
+                <w:sz w:val="21"/>
+                <w:szCs w:val="21"/>
+                <w:rtl/>
+              </w:rPr>
+              <w:t xml:space="preserve">20_build.do</w:t>
+            </w:r>
+            <w:r>
+              <w:rPr>
+                <w:rFonts w:ascii="Tahoma" w:hAnsi="Tahoma" w:cs="Tahoma"/>
+                <w:sz w:val="21"/>
+                <w:szCs w:val="21"/>
+                <w:rtl/>
+              </w:rPr>
+              <w:t xml:space="preserve">)</w:t>
+            </w:r>
+          </w:p>
+        </w:tc>
+        <w:tc>
+          <w:tcPr/>
+          <w:p>
+            <w:pPr>
+              <w:pStyle w:val="Compact"/>
+              <w:bidi/>
+            </w:pPr>
+            <w:r>
+              <w:rPr>
+                <w:rFonts w:ascii="Tahoma" w:hAnsi="Tahoma" w:cs="Tahoma"/>
+                <w:sz w:val="21"/>
+                <w:szCs w:val="21"/>
+                <w:rtl/>
+              </w:rPr>
+              <w:t xml:space="preserve">اهرم هدف تعریف نمی‌شود</w:t>
             </w:r>
           </w:p>
         </w:tc>
       </w:tr>
     </w:tbl>
-    <w:p>
-      <w:pPr>
-        <w:bidi/>
-      </w:pPr>
-      <w:r>
-        <w:rPr>
-          <w:rFonts w:ascii="Tahoma" w:hAnsi="Tahoma" w:cs="Tahoma"/>
-          <w:b/>
-          <w:bCs/>
-          <w:sz w:val="21"/>
-          <w:szCs w:val="21"/>
-          <w:rtl/>
-        </w:rPr>
-        <w:t xml:space="preserve">مواردی که در اکسل حذف نمی‌کنید:</w:t>
-      </w:r>
-    </w:p>
     <w:p>
       <w:pPr>
         <w:pStyle w:val="Compact"/>
@@ -793,7 +898,7 @@
           <w:szCs w:val="21"/>
           <w:rtl/>
         </w:rPr>
-        <w:t xml:space="preserve">همه‌ی شرکت‌ها سال مالی منتهی به اسفند دارند. این به‌عنوان ویژگی نمونه در متن نوشته می‌شود، نه به‌عنوان مرحله‌ی حذف.</w:t>
+        <w:t xml:space="preserve">همه‌ی شرکت‌ها پایان اسفند هستند. در متن به‌عنوان ویژگی نمونه می‌آید، نه مرحله‌ی حذف.</w:t>
       </w:r>
     </w:p>
     <w:p>
@@ -832,7 +937,7 @@
           <w:szCs w:val="21"/>
           <w:rtl/>
         </w:rPr>
-        <w:t xml:space="preserve">هیچ حداقلی اعمال نمی‌شود. هر سال-شرکتی که داده‌ی سال‌های قبل (وقفه‌ها) را داشته باشد، خودکار وارد برآورد می‌شود. شرکتی که سابقه‌ی کوتاهی دارد، فقط به‌اندازه‌ی داده‌اش مشارکت می‌کند. این قاعده به داده تعیین می‌شود، نه به انتخاب پژوهشگر، و داور آن را به‌راحتی می‌پذیرد.</w:t>
+        <w:t xml:space="preserve">اعمال نمی‌شود. هر سال-شرکتی که داده‌ی سال‌های قبل را داشته باشد خودکار وارد برآورد می‌شود.</w:t>
       </w:r>
     </w:p>
     <w:p>
@@ -853,7 +958,7 @@
           <w:szCs w:val="21"/>
           <w:rtl/>
         </w:rPr>
-        <w:t xml:space="preserve">حقوق صاحبان سهام صفر یا منفی:</w:t>
+        <w:t xml:space="preserve">توقف نماد:</w:t>
       </w:r>
       <w:r>
         <w:rPr>
@@ -871,44 +976,23 @@
           <w:szCs w:val="21"/>
           <w:rtl/>
         </w:rPr>
-        <w:t xml:space="preserve">کد Stata حذف می‌کند و تعداد را در برگه‌ی</w:t>
-      </w:r>
-      <w:r>
-        <w:rPr>
-          <w:rFonts w:ascii="Tahoma" w:hAnsi="Tahoma" w:cs="Tahoma"/>
-          <w:sz w:val="21"/>
-          <w:szCs w:val="21"/>
-          <w:rtl/>
-        </w:rPr>
-        <w:t xml:space="preserve"> </w:t>
-      </w:r>
-      <w:r>
-        <w:rPr>
-          <w:rStyle w:val="VerbatimChar"/>
-          <w:rFonts w:ascii="Tahoma" w:hAnsi="Tahoma" w:cs="Tahoma"/>
-          <w:sz w:val="21"/>
-          <w:szCs w:val="21"/>
-          <w:rtl/>
-        </w:rPr>
-        <w:t xml:space="preserve">T0_sample</w:t>
-      </w:r>
-      <w:r>
-        <w:rPr>
-          <w:rFonts w:ascii="Tahoma" w:hAnsi="Tahoma" w:cs="Tahoma"/>
-          <w:sz w:val="21"/>
-          <w:szCs w:val="21"/>
-          <w:rtl/>
-        </w:rPr>
-        <w:t xml:space="preserve"> </w:t>
-      </w:r>
-      <w:r>
-        <w:rPr>
-          <w:rFonts w:ascii="Tahoma" w:hAnsi="Tahoma" w:cs="Tahoma"/>
-          <w:sz w:val="21"/>
-          <w:szCs w:val="21"/>
-          <w:rtl/>
-        </w:rPr>
-        <w:t xml:space="preserve">فایل Tables.xlsx می‌نویسد.</w:t>
+        <w:t xml:space="preserve">داده‌اش در دسترس نیست و اعمال نمی‌شود. در بخش محدودیت‌ها یک جمله می‌آید.</w:t>
+      </w:r>
+    </w:p>
+    <w:p>
+      <w:pPr>
+        <w:bidi/>
+      </w:pPr>
+      <w:r>
+        <w:rPr>
+          <w:rFonts w:ascii="Tahoma" w:hAnsi="Tahoma" w:cs="Tahoma"/>
+          <w:b/>
+          <w:bCs/>
+          <w:sz w:val="21"/>
+          <w:szCs w:val="21"/>
+          <w:rtl/>
+        </w:rPr>
+        <w:t xml:space="preserve">خروجی‌ها:</w:t>
       </w:r>
     </w:p>
     <w:p>
@@ -916,20 +1000,103 @@
         <w:pStyle w:val="Compact"/>
         <w:numPr>
           <w:ilvl w:val="0"/>
-          <w:numId w:val="1003"/>
+          <w:numId w:val="1004"/>
         </w:numPr>
         <w:bidi/>
       </w:pPr>
       <w:r>
         <w:rPr>
           <w:rFonts w:ascii="Tahoma" w:hAnsi="Tahoma" w:cs="Tahoma"/>
+          <w:sz w:val="21"/>
+          <w:szCs w:val="21"/>
+          <w:rtl/>
+        </w:rPr>
+        <w:t xml:space="preserve">برگه‌ی</w:t>
+      </w:r>
+      <w:r>
+        <w:rPr>
+          <w:rFonts w:ascii="Tahoma" w:hAnsi="Tahoma" w:cs="Tahoma"/>
+          <w:sz w:val="21"/>
+          <w:szCs w:val="21"/>
+          <w:rtl/>
+        </w:rPr>
+        <w:t xml:space="preserve"> </w:t>
+      </w:r>
+      <w:r>
+        <w:rPr>
+          <w:rStyle w:val="VerbatimChar"/>
+          <w:rFonts w:ascii="Tahoma" w:hAnsi="Tahoma" w:cs="Tahoma"/>
+          <w:sz w:val="21"/>
+          <w:szCs w:val="21"/>
+          <w:rtl/>
+        </w:rPr>
+        <w:t xml:space="preserve">T0_sample</w:t>
+      </w:r>
+      <w:r>
+        <w:rPr>
+          <w:rFonts w:ascii="Tahoma" w:hAnsi="Tahoma" w:cs="Tahoma"/>
+          <w:sz w:val="21"/>
+          <w:szCs w:val="21"/>
+          <w:rtl/>
+        </w:rPr>
+        <w:t xml:space="preserve"> </w:t>
+      </w:r>
+      <w:r>
+        <w:rPr>
+          <w:rFonts w:ascii="Tahoma" w:hAnsi="Tahoma" w:cs="Tahoma"/>
+          <w:sz w:val="21"/>
+          <w:szCs w:val="21"/>
+          <w:rtl/>
+        </w:rPr>
+        <w:t xml:space="preserve">در</w:t>
+      </w:r>
+      <w:r>
+        <w:rPr>
+          <w:rFonts w:ascii="Tahoma" w:hAnsi="Tahoma" w:cs="Tahoma"/>
+          <w:sz w:val="21"/>
+          <w:szCs w:val="21"/>
+          <w:rtl/>
+        </w:rPr>
+        <w:t xml:space="preserve"> </w:t>
+      </w:r>
+      <w:r>
+        <w:rPr>
+          <w:rStyle w:val="VerbatimChar"/>
+          <w:rFonts w:ascii="Tahoma" w:hAnsi="Tahoma" w:cs="Tahoma"/>
+          <w:sz w:val="21"/>
+          <w:szCs w:val="21"/>
+          <w:rtl/>
+        </w:rPr>
+        <w:t xml:space="preserve">Tables.xlsx</w:t>
+      </w:r>
+      <w:r>
+        <w:rPr>
+          <w:rFonts w:ascii="Tahoma" w:hAnsi="Tahoma" w:cs="Tahoma"/>
+          <w:sz w:val="21"/>
+          <w:szCs w:val="21"/>
+          <w:rtl/>
+        </w:rPr>
+        <w:t xml:space="preserve">:</w:t>
+      </w:r>
+      <w:r>
+        <w:rPr>
+          <w:rFonts w:ascii="Tahoma" w:hAnsi="Tahoma" w:cs="Tahoma"/>
+          <w:sz w:val="21"/>
+          <w:szCs w:val="21"/>
+          <w:rtl/>
+        </w:rPr>
+        <w:t xml:space="preserve"> </w:t>
+      </w:r>
+      <w:r>
+        <w:rPr>
+          <w:rFonts w:ascii="Tahoma" w:hAnsi="Tahoma" w:cs="Tahoma"/>
           <w:b/>
           <w:bCs/>
           <w:sz w:val="21"/>
           <w:szCs w:val="21"/>
           <w:rtl/>
         </w:rPr>
-        <w:t xml:space="preserve">توقف نماد:</w:t>
+        <w:t xml:space="preserve">جدول کامل غربالگری</w:t>
       </w:r>
       <w:r>
         <w:rPr>
@@ -947,13 +1114,64 @@
           <w:szCs w:val="21"/>
           <w:rtl/>
         </w:rPr>
-        <w:t xml:space="preserve">داده‌اش در دسترس نیست و اعمال نمی‌شود. ارزش بازار پایان سال برای نماد متوقف همان آخرین قیمت است؛ در بخش محدودیت‌ها یک جمله می‌آید.</w:t>
+        <w:t xml:space="preserve">با تعداد شرکت و سال-شرکت در هر مرحله، آماده برای بخش 3.1 مقاله.</w:t>
       </w:r>
     </w:p>
     <w:p>
       <w:pPr>
+        <w:pStyle w:val="Compact"/>
+        <w:numPr>
+          <w:ilvl w:val="0"/>
+          <w:numId w:val="1004"/>
+        </w:numPr>
         <w:bidi/>
       </w:pPr>
+      <w:r>
+        <w:rPr>
+          <w:rFonts w:ascii="Tahoma" w:hAnsi="Tahoma" w:cs="Tahoma"/>
+          <w:sz w:val="21"/>
+          <w:szCs w:val="21"/>
+          <w:rtl/>
+        </w:rPr>
+        <w:t xml:space="preserve">فایل</w:t>
+      </w:r>
+      <w:r>
+        <w:rPr>
+          <w:rFonts w:ascii="Tahoma" w:hAnsi="Tahoma" w:cs="Tahoma"/>
+          <w:sz w:val="21"/>
+          <w:szCs w:val="21"/>
+          <w:rtl/>
+        </w:rPr>
+        <w:t xml:space="preserve"> </w:t>
+      </w:r>
+      <w:r>
+        <w:rPr>
+          <w:rStyle w:val="VerbatimChar"/>
+          <w:rFonts w:ascii="Tahoma" w:hAnsi="Tahoma" w:cs="Tahoma"/>
+          <w:sz w:val="21"/>
+          <w:szCs w:val="21"/>
+          <w:rtl/>
+        </w:rPr>
+        <w:t xml:space="preserve">Screening_check.xlsx</w:t>
+      </w:r>
+      <w:r>
+        <w:rPr>
+          <w:rFonts w:ascii="Tahoma" w:hAnsi="Tahoma" w:cs="Tahoma"/>
+          <w:sz w:val="21"/>
+          <w:szCs w:val="21"/>
+          <w:rtl/>
+        </w:rPr>
+        <w:t xml:space="preserve">: فهرست صنایع حذف‌شده به‌عنوان مالی، فهرست صنایع باقی‌مانده، و ردیف‌های تکراری.</w:t>
+      </w:r>
+      <w:r>
+        <w:rPr>
+          <w:rFonts w:ascii="Tahoma" w:hAnsi="Tahoma" w:cs="Tahoma"/>
+          <w:sz w:val="21"/>
+          <w:szCs w:val="21"/>
+          <w:rtl/>
+        </w:rPr>
+        <w:t xml:space="preserve"> </w:t>
+      </w:r>
       <w:r>
         <w:rPr>
           <w:rFonts w:ascii="Tahoma" w:hAnsi="Tahoma" w:cs="Tahoma"/>
@@ -963,7 +1181,7 @@
           <w:szCs w:val="21"/>
           <w:rtl/>
         </w:rPr>
-        <w:t xml:space="preserve">جدول نمونه‌ی مقاله</w:t>
+        <w:t xml:space="preserve">بعد از اولین اجرا حتماً فهرست صنایع حذف‌شده را نگاه کنید.</w:t>
       </w:r>
       <w:r>
         <w:rPr>
@@ -981,7 +1199,7 @@
           <w:szCs w:val="21"/>
           <w:rtl/>
         </w:rPr>
-        <w:t xml:space="preserve">از ترکیب یادداشت‌های شما (ردیف‌های ۱ تا ۳) و برگه‌ی</w:t>
+        <w:t xml:space="preserve">اگر صنعتی اشتباه حذف یا نگه داشته شده، کلمه‌ها یا کدهای صنعت را در بخش 0 فایل</w:t>
       </w:r>
       <w:r>
         <w:rPr>
@@ -1000,7 +1218,7 @@
           <w:szCs w:val="21"/>
           <w:rtl/>
         </w:rPr>
-        <w:t xml:space="preserve">T0_sample</w:t>
+        <w:t xml:space="preserve">00_run_all.do</w:t>
       </w:r>
       <w:r>
         <w:rPr>
@@ -1018,7 +1236,196 @@
           <w:szCs w:val="21"/>
           <w:rtl/>
         </w:rPr>
-        <w:t xml:space="preserve">(بقیه‌ی ردیف‌ها) ساخته می‌شود:</w:t>
+        <w:t xml:space="preserve">(</w:t>
+      </w:r>
+      <w:r>
+        <w:rPr>
+          <w:rStyle w:val="VerbatimChar"/>
+          <w:rFonts w:ascii="Tahoma" w:hAnsi="Tahoma" w:cs="Tahoma"/>
+          <w:sz w:val="21"/>
+          <w:szCs w:val="21"/>
+          <w:rtl/>
+        </w:rPr>
+        <w:t xml:space="preserve">SCR_FINWORDS</w:t>
+      </w:r>
+      <w:r>
+        <w:rPr>
+          <w:rFonts w:ascii="Tahoma" w:hAnsi="Tahoma" w:cs="Tahoma"/>
+          <w:sz w:val="21"/>
+          <w:szCs w:val="21"/>
+          <w:rtl/>
+        </w:rPr>
+        <w:t xml:space="preserve"> </w:t>
+      </w:r>
+      <w:r>
+        <w:rPr>
+          <w:rFonts w:ascii="Tahoma" w:hAnsi="Tahoma" w:cs="Tahoma"/>
+          <w:sz w:val="21"/>
+          <w:szCs w:val="21"/>
+          <w:rtl/>
+        </w:rPr>
+        <w:t xml:space="preserve">و</w:t>
+      </w:r>
+      <w:r>
+        <w:rPr>
+          <w:rFonts w:ascii="Tahoma" w:hAnsi="Tahoma" w:cs="Tahoma"/>
+          <w:sz w:val="21"/>
+          <w:szCs w:val="21"/>
+          <w:rtl/>
+        </w:rPr>
+        <w:t xml:space="preserve"> </w:t>
+      </w:r>
+      <w:r>
+        <w:rPr>
+          <w:rStyle w:val="VerbatimChar"/>
+          <w:rFonts w:ascii="Tahoma" w:hAnsi="Tahoma" w:cs="Tahoma"/>
+          <w:sz w:val="21"/>
+          <w:szCs w:val="21"/>
+          <w:rtl/>
+        </w:rPr>
+        <w:t xml:space="preserve">SCR_FINCODES</w:t>
+      </w:r>
+      <w:r>
+        <w:rPr>
+          <w:rFonts w:ascii="Tahoma" w:hAnsi="Tahoma" w:cs="Tahoma"/>
+          <w:sz w:val="21"/>
+          <w:szCs w:val="21"/>
+          <w:rtl/>
+        </w:rPr>
+        <w:t xml:space="preserve">) اصلاح کنید.</w:t>
+      </w:r>
+    </w:p>
+    <w:p>
+      <w:pPr>
+        <w:pStyle w:val="Compact"/>
+        <w:numPr>
+          <w:ilvl w:val="0"/>
+          <w:numId w:val="1004"/>
+        </w:numPr>
+        <w:bidi/>
+      </w:pPr>
+      <w:r>
+        <w:rPr>
+          <w:rFonts w:ascii="Tahoma" w:hAnsi="Tahoma" w:cs="Tahoma"/>
+          <w:sz w:val="21"/>
+          <w:szCs w:val="21"/>
+          <w:rtl/>
+        </w:rPr>
+        <w:t xml:space="preserve">در لاگ: میانه‌ی جمع دارایی‌ها برای هر سال (برای پیدا کردن تغییر واحد پول)، تعداد داده‌های ناموجود، و سهم CFI منفی (برای کنترل علامت).</w:t>
+      </w:r>
+    </w:p>
+    <w:bookmarkEnd w:id="10"/>
+    <w:bookmarkStart w:id="11" w:name="ساختار-فایل"/>
+    <w:p>
+      <w:pPr>
+        <w:pStyle w:val="Heading1"/>
+        <w:bidi/>
+      </w:pPr>
+      <w:r>
+        <w:rPr>
+          <w:rFonts w:ascii="Tahoma" w:hAnsi="Tahoma" w:cs="Tahoma"/>
+          <w:sz w:val="21"/>
+          <w:szCs w:val="21"/>
+          <w:rtl/>
+        </w:rPr>
+        <w:t xml:space="preserve">۳. ساختار فایل</w:t>
+      </w:r>
+    </w:p>
+    <w:p>
+      <w:pPr>
+        <w:bidi/>
+      </w:pPr>
+      <w:r>
+        <w:rPr>
+          <w:rFonts w:ascii="Tahoma" w:hAnsi="Tahoma" w:cs="Tahoma"/>
+          <w:sz w:val="21"/>
+          <w:szCs w:val="21"/>
+          <w:rtl/>
+        </w:rPr>
+        <w:t xml:space="preserve">نام فایل:</w:t>
+      </w:r>
+      <w:r>
+        <w:rPr>
+          <w:rFonts w:ascii="Tahoma" w:hAnsi="Tahoma" w:cs="Tahoma"/>
+          <w:sz w:val="21"/>
+          <w:szCs w:val="21"/>
+          <w:rtl/>
+        </w:rPr>
+        <w:t xml:space="preserve"> </w:t>
+      </w:r>
+      <w:r>
+        <w:rPr>
+          <w:rStyle w:val="VerbatimChar"/>
+          <w:rFonts w:ascii="Tahoma" w:hAnsi="Tahoma" w:cs="Tahoma"/>
+          <w:b/>
+          <w:bCs/>
+          <w:sz w:val="21"/>
+          <w:szCs w:val="21"/>
+          <w:rtl/>
+        </w:rPr>
+        <w:t xml:space="preserve">Raw_All_Data.xlsx</w:t>
+      </w:r>
+      <w:r>
+        <w:rPr>
+          <w:rFonts w:ascii="Tahoma" w:hAnsi="Tahoma" w:cs="Tahoma"/>
+          <w:sz w:val="21"/>
+          <w:szCs w:val="21"/>
+          <w:rtl/>
+        </w:rPr>
+        <w:t xml:space="preserve"> </w:t>
+      </w:r>
+      <w:r>
+        <w:rPr>
+          <w:rFonts w:ascii="Tahoma" w:hAnsi="Tahoma" w:cs="Tahoma"/>
+          <w:sz w:val="21"/>
+          <w:szCs w:val="21"/>
+          <w:rtl/>
+        </w:rPr>
+        <w:t xml:space="preserve">در پوشه‌ی</w:t>
+      </w:r>
+      <w:r>
+        <w:rPr>
+          <w:rFonts w:ascii="Tahoma" w:hAnsi="Tahoma" w:cs="Tahoma"/>
+          <w:sz w:val="21"/>
+          <w:szCs w:val="21"/>
+          <w:rtl/>
+        </w:rPr>
+        <w:t xml:space="preserve"> </w:t>
+      </w:r>
+      <w:r>
+        <w:rPr>
+          <w:rStyle w:val="VerbatimChar"/>
+          <w:rFonts w:ascii="Tahoma" w:hAnsi="Tahoma" w:cs="Tahoma"/>
+          <w:sz w:val="21"/>
+          <w:szCs w:val="21"/>
+          <w:rtl/>
+        </w:rPr>
+        <w:t xml:space="preserve">C:/Users/Rohi/Desktop/Data</w:t>
+      </w:r>
+      <w:r>
+        <w:rPr>
+          <w:rFonts w:ascii="Tahoma" w:hAnsi="Tahoma" w:cs="Tahoma"/>
+          <w:sz w:val="21"/>
+          <w:szCs w:val="21"/>
+          <w:rtl/>
+        </w:rPr>
+        <w:t xml:space="preserve">. یک برگه، یک ردیف برای هر شرکت در هر سال.</w:t>
+      </w:r>
+    </w:p>
+    <w:p>
+      <w:pPr>
+        <w:bidi/>
+      </w:pPr>
+      <w:r>
+        <w:rPr>
+          <w:rFonts w:ascii="Tahoma" w:hAnsi="Tahoma" w:cs="Tahoma"/>
+          <w:b/>
+          <w:bCs/>
+          <w:sz w:val="21"/>
+          <w:szCs w:val="21"/>
+          <w:rtl/>
+        </w:rPr>
+        <w:t xml:space="preserve">نام ستون‌های شناسه (ردیف اول فایل) را این‌طور بنویسید:</w:t>
       </w:r>
     </w:p>
     <w:tbl>
@@ -1037,496 +1444,6 @@
         <w:tblLook w:firstRow="1" w:lastRow="0" w:firstColumn="0" w:lastColumn="0" w:noHBand="0" w:noVBand="0" w:val="0020"/>
       </w:tblPr>
       <w:tblGrid>
-        <w:gridCol w:w="1980"/>
-        <w:gridCol w:w="1980"/>
-        <w:gridCol w:w="1980"/>
-        <w:gridCol w:w="1980"/>
-      </w:tblGrid>
-      <w:tr>
-        <w:trPr>
-          <w:tblHeader w:val="on"/>
-        </w:trPr>
-        <w:tc>
-          <w:tcPr>
-            <w:shd w:val="clear" w:color="auto" w:fill="E8ECF3"/>
-          </w:tcPr>
-          <w:p>
-            <w:pPr>
-              <w:pStyle w:val="Compact"/>
-              <w:bidi/>
-            </w:pPr>
-            <w:r>
-              <w:rPr>
-                <w:rFonts w:ascii="Tahoma" w:hAnsi="Tahoma" w:cs="Tahoma"/>
-                <w:b/>
-                <w:sz w:val="21"/>
-                <w:szCs w:val="21"/>
-                <w:rtl/>
-              </w:rPr>
-              <w:t xml:space="preserve">مرحله</w:t>
-            </w:r>
-          </w:p>
-        </w:tc>
-        <w:tc>
-          <w:tcPr>
-            <w:shd w:val="clear" w:color="auto" w:fill="E8ECF3"/>
-          </w:tcPr>
-          <w:p>
-            <w:pPr>
-              <w:pStyle w:val="Compact"/>
-              <w:bidi/>
-            </w:pPr>
-            <w:r>
-              <w:rPr>
-                <w:rFonts w:ascii="Tahoma" w:hAnsi="Tahoma" w:cs="Tahoma"/>
-                <w:b/>
-                <w:sz w:val="21"/>
-                <w:szCs w:val="21"/>
-                <w:rtl/>
-              </w:rPr>
-              <w:t xml:space="preserve">شرکت</w:t>
-            </w:r>
-          </w:p>
-        </w:tc>
-        <w:tc>
-          <w:tcPr>
-            <w:shd w:val="clear" w:color="auto" w:fill="E8ECF3"/>
-          </w:tcPr>
-          <w:p>
-            <w:pPr>
-              <w:pStyle w:val="Compact"/>
-              <w:bidi/>
-            </w:pPr>
-            <w:r>
-              <w:rPr>
-                <w:rFonts w:ascii="Tahoma" w:hAnsi="Tahoma" w:cs="Tahoma"/>
-                <w:b/>
-                <w:sz w:val="21"/>
-                <w:szCs w:val="21"/>
-                <w:rtl/>
-              </w:rPr>
-              <w:t xml:space="preserve">سال-شرکت</w:t>
-            </w:r>
-          </w:p>
-        </w:tc>
-        <w:tc>
-          <w:tcPr>
-            <w:shd w:val="clear" w:color="auto" w:fill="E8ECF3"/>
-          </w:tcPr>
-          <w:p>
-            <w:pPr>
-              <w:pStyle w:val="Compact"/>
-              <w:bidi/>
-            </w:pPr>
-            <w:r>
-              <w:rPr>
-                <w:rFonts w:ascii="Tahoma" w:hAnsi="Tahoma" w:cs="Tahoma"/>
-                <w:b/>
-                <w:sz w:val="21"/>
-                <w:szCs w:val="21"/>
-                <w:rtl/>
-              </w:rPr>
-              <w:t xml:space="preserve">منبع عدد</w:t>
-            </w:r>
-          </w:p>
-        </w:tc>
-      </w:tr>
-      <w:tr>
-        <w:tc>
-          <w:tcPr/>
-          <w:p>
-            <w:pPr>
-              <w:pStyle w:val="Compact"/>
-              <w:bidi/>
-            </w:pPr>
-            <w:r>
-              <w:rPr>
-                <w:rFonts w:ascii="Tahoma" w:hAnsi="Tahoma" w:cs="Tahoma"/>
-                <w:sz w:val="21"/>
-                <w:szCs w:val="21"/>
-                <w:rtl/>
-              </w:rPr>
-              <w:t xml:space="preserve">شرکت‌های بورس تهران، ۱۳۸۰–۱۴۰۳</w:t>
-            </w:r>
-          </w:p>
-        </w:tc>
-        <w:tc>
-          <w:tcPr/>
-          <w:p>
-            <w:pPr>
-              <w:pStyle w:val="Compact"/>
-              <w:bidi/>
-            </w:pPr>
-          </w:p>
-        </w:tc>
-        <w:tc>
-          <w:tcPr/>
-          <w:p>
-            <w:pPr>
-              <w:pStyle w:val="Compact"/>
-              <w:bidi/>
-            </w:pPr>
-          </w:p>
-        </w:tc>
-        <w:tc>
-          <w:tcPr/>
-          <w:p>
-            <w:pPr>
-              <w:pStyle w:val="Compact"/>
-              <w:bidi/>
-            </w:pPr>
-            <w:r>
-              <w:rPr>
-                <w:rFonts w:ascii="Tahoma" w:hAnsi="Tahoma" w:cs="Tahoma"/>
-                <w:sz w:val="21"/>
-                <w:szCs w:val="21"/>
-                <w:rtl/>
-              </w:rPr>
-              <w:t xml:space="preserve">یادداشت شما</w:t>
-            </w:r>
-          </w:p>
-        </w:tc>
-      </w:tr>
-      <w:tr>
-        <w:tc>
-          <w:tcPr/>
-          <w:p>
-            <w:pPr>
-              <w:pStyle w:val="Compact"/>
-              <w:bidi/>
-            </w:pPr>
-            <w:r>
-              <w:rPr>
-                <w:rFonts w:ascii="Tahoma" w:hAnsi="Tahoma" w:cs="Tahoma"/>
-                <w:sz w:val="21"/>
-                <w:szCs w:val="21"/>
-                <w:rtl/>
-              </w:rPr>
-              <w:t xml:space="preserve">منهای سال-شرکت‌های فرابورس</w:t>
-            </w:r>
-          </w:p>
-        </w:tc>
-        <w:tc>
-          <w:tcPr/>
-          <w:p>
-            <w:pPr>
-              <w:pStyle w:val="Compact"/>
-              <w:bidi/>
-            </w:pPr>
-          </w:p>
-        </w:tc>
-        <w:tc>
-          <w:tcPr/>
-          <w:p>
-            <w:pPr>
-              <w:pStyle w:val="Compact"/>
-              <w:bidi/>
-            </w:pPr>
-          </w:p>
-        </w:tc>
-        <w:tc>
-          <w:tcPr/>
-          <w:p>
-            <w:pPr>
-              <w:pStyle w:val="Compact"/>
-              <w:bidi/>
-            </w:pPr>
-            <w:r>
-              <w:rPr>
-                <w:rFonts w:ascii="Tahoma" w:hAnsi="Tahoma" w:cs="Tahoma"/>
-                <w:sz w:val="21"/>
-                <w:szCs w:val="21"/>
-                <w:rtl/>
-              </w:rPr>
-              <w:t xml:space="preserve">یادداشت شما</w:t>
-            </w:r>
-          </w:p>
-        </w:tc>
-      </w:tr>
-      <w:tr>
-        <w:tc>
-          <w:tcPr/>
-          <w:p>
-            <w:pPr>
-              <w:pStyle w:val="Compact"/>
-              <w:bidi/>
-            </w:pPr>
-            <w:r>
-              <w:rPr>
-                <w:rFonts w:ascii="Tahoma" w:hAnsi="Tahoma" w:cs="Tahoma"/>
-                <w:sz w:val="21"/>
-                <w:szCs w:val="21"/>
-                <w:rtl/>
-              </w:rPr>
-              <w:t xml:space="preserve">منهای شرکت‌های مالی، سرمایه‌گذاری، هلدینگ و لیزینگ</w:t>
-            </w:r>
-          </w:p>
-        </w:tc>
-        <w:tc>
-          <w:tcPr/>
-          <w:p>
-            <w:pPr>
-              <w:pStyle w:val="Compact"/>
-              <w:bidi/>
-            </w:pPr>
-          </w:p>
-        </w:tc>
-        <w:tc>
-          <w:tcPr/>
-          <w:p>
-            <w:pPr>
-              <w:pStyle w:val="Compact"/>
-              <w:bidi/>
-            </w:pPr>
-          </w:p>
-        </w:tc>
-        <w:tc>
-          <w:tcPr/>
-          <w:p>
-            <w:pPr>
-              <w:pStyle w:val="Compact"/>
-              <w:bidi/>
-            </w:pPr>
-            <w:r>
-              <w:rPr>
-                <w:rFonts w:ascii="Tahoma" w:hAnsi="Tahoma" w:cs="Tahoma"/>
-                <w:sz w:val="21"/>
-                <w:szCs w:val="21"/>
-                <w:rtl/>
-              </w:rPr>
-              <w:t xml:space="preserve">یادداشت شما</w:t>
-            </w:r>
-          </w:p>
-        </w:tc>
-      </w:tr>
-      <w:tr>
-        <w:tc>
-          <w:tcPr/>
-          <w:p>
-            <w:pPr>
-              <w:pStyle w:val="Compact"/>
-              <w:bidi/>
-            </w:pPr>
-            <w:r>
-              <w:rPr>
-                <w:rFonts w:ascii="Tahoma" w:hAnsi="Tahoma" w:cs="Tahoma"/>
-                <w:sz w:val="21"/>
-                <w:szCs w:val="21"/>
-                <w:rtl/>
-              </w:rPr>
-              <w:t xml:space="preserve">منهای حقوق صاحبان سهام ≤ ۰</w:t>
-            </w:r>
-          </w:p>
-        </w:tc>
-        <w:tc>
-          <w:tcPr/>
-          <w:p>
-            <w:pPr>
-              <w:pStyle w:val="Compact"/>
-              <w:bidi/>
-            </w:pPr>
-            <w:r>
-              <w:rPr>
-                <w:rFonts w:ascii="Tahoma" w:hAnsi="Tahoma" w:cs="Tahoma"/>
-                <w:sz w:val="21"/>
-                <w:szCs w:val="21"/>
-                <w:rtl/>
-              </w:rPr>
-              <w:t xml:space="preserve">—</w:t>
-            </w:r>
-          </w:p>
-        </w:tc>
-        <w:tc>
-          <w:tcPr/>
-          <w:p>
-            <w:pPr>
-              <w:pStyle w:val="Compact"/>
-              <w:bidi/>
-            </w:pPr>
-          </w:p>
-        </w:tc>
-        <w:tc>
-          <w:tcPr/>
-          <w:p>
-            <w:pPr>
-              <w:pStyle w:val="Compact"/>
-              <w:bidi/>
-            </w:pPr>
-            <w:r>
-              <w:rPr>
-                <w:rFonts w:ascii="Tahoma" w:hAnsi="Tahoma" w:cs="Tahoma"/>
-                <w:sz w:val="21"/>
-                <w:szCs w:val="21"/>
-                <w:rtl/>
-              </w:rPr>
-              <w:t xml:space="preserve">T0_sample</w:t>
-            </w:r>
-          </w:p>
-        </w:tc>
-      </w:tr>
-      <w:tr>
-        <w:tc>
-          <w:tcPr/>
-          <w:p>
-            <w:pPr>
-              <w:pStyle w:val="Compact"/>
-              <w:bidi/>
-            </w:pPr>
-            <w:r>
-              <w:rPr>
-                <w:rFonts w:ascii="Tahoma" w:hAnsi="Tahoma" w:cs="Tahoma"/>
-                <w:sz w:val="21"/>
-                <w:szCs w:val="21"/>
-                <w:rtl/>
-              </w:rPr>
-              <w:t xml:space="preserve">پنل نهایی (با سال پایه)</w:t>
-            </w:r>
-          </w:p>
-        </w:tc>
-        <w:tc>
-          <w:tcPr/>
-          <w:p>
-            <w:pPr>
-              <w:pStyle w:val="Compact"/>
-              <w:bidi/>
-            </w:pPr>
-          </w:p>
-        </w:tc>
-        <w:tc>
-          <w:tcPr/>
-          <w:p>
-            <w:pPr>
-              <w:pStyle w:val="Compact"/>
-              <w:bidi/>
-            </w:pPr>
-          </w:p>
-        </w:tc>
-        <w:tc>
-          <w:tcPr/>
-          <w:p>
-            <w:pPr>
-              <w:pStyle w:val="Compact"/>
-              <w:bidi/>
-            </w:pPr>
-            <w:r>
-              <w:rPr>
-                <w:rFonts w:ascii="Tahoma" w:hAnsi="Tahoma" w:cs="Tahoma"/>
-                <w:sz w:val="21"/>
-                <w:szCs w:val="21"/>
-                <w:rtl/>
-              </w:rPr>
-              <w:t xml:space="preserve">T0_sample</w:t>
-            </w:r>
-          </w:p>
-        </w:tc>
-      </w:tr>
-      <w:tr>
-        <w:tc>
-          <w:tcPr/>
-          <w:p>
-            <w:pPr>
-              <w:pStyle w:val="Compact"/>
-              <w:bidi/>
-            </w:pPr>
-            <w:r>
-              <w:rPr>
-                <w:rFonts w:ascii="Tahoma" w:hAnsi="Tahoma" w:cs="Tahoma"/>
-                <w:sz w:val="21"/>
-                <w:szCs w:val="21"/>
-                <w:rtl/>
-              </w:rPr>
-              <w:t xml:space="preserve">نمونه‌ی برآورد GMM (وقفه‌ها موجود)</w:t>
-            </w:r>
-          </w:p>
-        </w:tc>
-        <w:tc>
-          <w:tcPr/>
-          <w:p>
-            <w:pPr>
-              <w:pStyle w:val="Compact"/>
-              <w:bidi/>
-            </w:pPr>
-          </w:p>
-        </w:tc>
-        <w:tc>
-          <w:tcPr/>
-          <w:p>
-            <w:pPr>
-              <w:pStyle w:val="Compact"/>
-              <w:bidi/>
-            </w:pPr>
-          </w:p>
-        </w:tc>
-        <w:tc>
-          <w:tcPr/>
-          <w:p>
-            <w:pPr>
-              <w:pStyle w:val="Compact"/>
-              <w:bidi/>
-            </w:pPr>
-            <w:r>
-              <w:rPr>
-                <w:rFonts w:ascii="Tahoma" w:hAnsi="Tahoma" w:cs="Tahoma"/>
-                <w:sz w:val="21"/>
-                <w:szCs w:val="21"/>
-                <w:rtl/>
-              </w:rPr>
-              <w:t xml:space="preserve">T0_sample</w:t>
-            </w:r>
-          </w:p>
-        </w:tc>
-      </w:tr>
-    </w:tbl>
-    <w:bookmarkEnd w:id="10"/>
-    <w:bookmarkStart w:id="11" w:name="ساختار-فایل"/>
-    <w:p>
-      <w:pPr>
-        <w:pStyle w:val="Heading1"/>
-        <w:bidi/>
-      </w:pPr>
-      <w:r>
-        <w:rPr>
-          <w:rFonts w:ascii="Tahoma" w:hAnsi="Tahoma" w:cs="Tahoma"/>
-          <w:sz w:val="21"/>
-          <w:szCs w:val="21"/>
-          <w:rtl/>
-        </w:rPr>
-        <w:t xml:space="preserve">۳. ساختار فایل</w:t>
-      </w:r>
-    </w:p>
-    <w:p>
-      <w:pPr>
-        <w:bidi/>
-      </w:pPr>
-      <w:r>
-        <w:rPr>
-          <w:rFonts w:ascii="Tahoma" w:hAnsi="Tahoma" w:cs="Tahoma"/>
-          <w:b/>
-          <w:bCs/>
-          <w:sz w:val="21"/>
-          <w:szCs w:val="21"/>
-          <w:rtl/>
-        </w:rPr>
-        <w:t xml:space="preserve">تبدیل ستون‌های شناسه‌ی فایل شما:</w:t>
-      </w:r>
-    </w:p>
-    <w:tbl>
-      <w:tblPr>
-        <w:tblStyle w:val="Table"/>
-        <w:bidiVisual/>
-        <w:tblW w:type="pct" w:w="5000"/>
-        <w:tblBorders>
-          <w:top w:val="single" w:sz="4" w:space="0" w:color="808080"/>
-          <w:left w:val="single" w:sz="4" w:space="0" w:color="808080"/>
-          <w:bottom w:val="single" w:sz="4" w:space="0" w:color="808080"/>
-          <w:right w:val="single" w:sz="4" w:space="0" w:color="808080"/>
-          <w:insideH w:val="single" w:sz="4" w:space="0" w:color="808080"/>
-          <w:insideV w:val="single" w:sz="4" w:space="0" w:color="808080"/>
-        </w:tblBorders>
-        <w:tblLayout w:type="fixed"/>
-        <w:tblLook w:firstRow="1" w:lastRow="0" w:firstColumn="0" w:lastColumn="0" w:noHBand="0" w:noVBand="0" w:val="0020"/>
-      </w:tblPr>
-      <w:tblGrid>
         <w:gridCol w:w="3960"/>
         <w:gridCol w:w="3960"/>
       </w:tblGrid>
@@ -1572,7 +1489,7 @@
                 <w:szCs w:val="21"/>
                 <w:rtl/>
               </w:rPr>
-              <w:t xml:space="preserve">نام جدید در فایل نهایی</w:t>
+              <w:t xml:space="preserve">نام در فایل</w:t>
             </w:r>
           </w:p>
         </w:tc>
@@ -1592,7 +1509,7 @@
                 <w:szCs w:val="21"/>
                 <w:rtl/>
               </w:rPr>
-              <w:t xml:space="preserve">شرکت (firmcode)</w:t>
+              <w:t xml:space="preserve">شرکت (firm)</w:t>
             </w:r>
           </w:p>
         </w:tc>
@@ -1612,7 +1529,7 @@
                 <w:szCs w:val="21"/>
                 <w:rtl/>
               </w:rPr>
-              <w:t xml:space="preserve">FirmCode</w:t>
+              <w:t xml:space="preserve">Firm</w:t>
             </w:r>
           </w:p>
         </w:tc>
@@ -1632,7 +1549,7 @@
                 <w:szCs w:val="21"/>
                 <w:rtl/>
               </w:rPr>
-              <w:t xml:space="preserve">سال مالی (year)</w:t>
+              <w:t xml:space="preserve">شرکت (firmcode)</w:t>
             </w:r>
           </w:p>
         </w:tc>
@@ -1652,7 +1569,7 @@
                 <w:szCs w:val="21"/>
                 <w:rtl/>
               </w:rPr>
-              <w:t xml:space="preserve">Year</w:t>
+              <w:t xml:space="preserve">FirmCode</w:t>
             </w:r>
           </w:p>
         </w:tc>
@@ -1672,7 +1589,7 @@
                 <w:szCs w:val="21"/>
                 <w:rtl/>
               </w:rPr>
-              <w:t xml:space="preserve">کدصنعت کلی (ind)</w:t>
+              <w:t xml:space="preserve">سال مالی (year)</w:t>
             </w:r>
           </w:p>
         </w:tc>
@@ -1692,7 +1609,7 @@
                 <w:szCs w:val="21"/>
                 <w:rtl/>
               </w:rPr>
-              <w:t xml:space="preserve">IndID</w:t>
+              <w:t xml:space="preserve">Year</w:t>
             </w:r>
           </w:p>
         </w:tc>
@@ -1712,7 +1629,7 @@
                 <w:szCs w:val="21"/>
                 <w:rtl/>
               </w:rPr>
-              <w:t xml:space="preserve">صنعت (industry)</w:t>
+              <w:t xml:space="preserve">کد صنعت جزئی (industry)</w:t>
             </w:r>
           </w:p>
         </w:tc>
@@ -1732,7 +1649,7 @@
                 <w:szCs w:val="21"/>
                 <w:rtl/>
               </w:rPr>
-              <w:t xml:space="preserve">Industry</w:t>
+              <w:t xml:space="preserve">IndDetail</w:t>
             </w:r>
           </w:p>
         </w:tc>
@@ -1752,7 +1669,7 @@
                 <w:szCs w:val="21"/>
                 <w:rtl/>
               </w:rPr>
-              <w:t xml:space="preserve">نماد (x2)</w:t>
+              <w:t xml:space="preserve">کدصنعت کلی (ind)</w:t>
             </w:r>
           </w:p>
         </w:tc>
@@ -1772,7 +1689,7 @@
                 <w:szCs w:val="21"/>
                 <w:rtl/>
               </w:rPr>
-              <w:t xml:space="preserve">Symbol</w:t>
+              <w:t xml:space="preserve">IndID</w:t>
             </w:r>
           </w:p>
         </w:tc>
@@ -1792,35 +1709,17 @@
                 <w:szCs w:val="21"/>
                 <w:rtl/>
               </w:rPr>
-              <w:t xml:space="preserve">شرکت (firm)، کد صنعت جزئی، طبقه، بازار (x1)</w:t>
-            </w:r>
-          </w:p>
-        </w:tc>
-        <w:tc>
-          <w:tcPr/>
-          <w:p>
-            <w:pPr>
-              <w:pStyle w:val="Compact"/>
-              <w:bidi/>
-            </w:pPr>
-            <w:r>
-              <w:rPr>
-                <w:rFonts w:ascii="Tahoma" w:hAnsi="Tahoma" w:cs="Tahoma"/>
-                <w:sz w:val="21"/>
-                <w:szCs w:val="21"/>
-                <w:rtl/>
-              </w:rPr>
-              <w:t xml:space="preserve">بعد از غربالگری</w:t>
-            </w:r>
-            <w:r>
-              <w:rPr>
-                <w:rFonts w:ascii="Tahoma" w:hAnsi="Tahoma" w:cs="Tahoma"/>
-                <w:sz w:val="21"/>
-                <w:szCs w:val="21"/>
-                <w:rtl/>
-              </w:rPr>
-              <w:t xml:space="preserve"> </w:t>
-            </w:r>
+              <w:t xml:space="preserve">صنعت (industry)</w:t>
+            </w:r>
+          </w:p>
+        </w:tc>
+        <w:tc>
+          <w:tcPr/>
+          <w:p>
+            <w:pPr>
+              <w:pStyle w:val="Compact"/>
+              <w:bidi/>
+            </w:pPr>
             <w:r>
               <w:rPr>
                 <w:rFonts w:ascii="Tahoma" w:hAnsi="Tahoma" w:cs="Tahoma"/>
@@ -1830,16 +1729,127 @@
                 <w:szCs w:val="21"/>
                 <w:rtl/>
               </w:rPr>
-              <w:t xml:space="preserve">حذف شوند</w:t>
-            </w:r>
-            <w:r>
-              <w:rPr>
-                <w:rFonts w:ascii="Tahoma" w:hAnsi="Tahoma" w:cs="Tahoma"/>
-                <w:sz w:val="21"/>
-                <w:szCs w:val="21"/>
-                <w:rtl/>
-              </w:rPr>
-              <w:t xml:space="preserve">. دو ستون با نام یکسان industry در فایل نماند.</w:t>
+              <w:t xml:space="preserve">Industry</w:t>
+            </w:r>
+          </w:p>
+        </w:tc>
+      </w:tr>
+      <w:tr>
+        <w:tc>
+          <w:tcPr/>
+          <w:p>
+            <w:pPr>
+              <w:pStyle w:val="Compact"/>
+              <w:bidi/>
+            </w:pPr>
+            <w:r>
+              <w:rPr>
+                <w:rFonts w:ascii="Tahoma" w:hAnsi="Tahoma" w:cs="Tahoma"/>
+                <w:sz w:val="21"/>
+                <w:szCs w:val="21"/>
+                <w:rtl/>
+              </w:rPr>
+              <w:t xml:space="preserve">طبقه (category)</w:t>
+            </w:r>
+          </w:p>
+        </w:tc>
+        <w:tc>
+          <w:tcPr/>
+          <w:p>
+            <w:pPr>
+              <w:pStyle w:val="Compact"/>
+              <w:bidi/>
+            </w:pPr>
+            <w:r>
+              <w:rPr>
+                <w:rFonts w:ascii="Tahoma" w:hAnsi="Tahoma" w:cs="Tahoma"/>
+                <w:b/>
+                <w:bCs/>
+                <w:sz w:val="21"/>
+                <w:szCs w:val="21"/>
+                <w:rtl/>
+              </w:rPr>
+              <w:t xml:space="preserve">Category</w:t>
+            </w:r>
+          </w:p>
+        </w:tc>
+      </w:tr>
+      <w:tr>
+        <w:tc>
+          <w:tcPr/>
+          <w:p>
+            <w:pPr>
+              <w:pStyle w:val="Compact"/>
+              <w:bidi/>
+            </w:pPr>
+            <w:r>
+              <w:rPr>
+                <w:rFonts w:ascii="Tahoma" w:hAnsi="Tahoma" w:cs="Tahoma"/>
+                <w:sz w:val="21"/>
+                <w:szCs w:val="21"/>
+                <w:rtl/>
+              </w:rPr>
+              <w:t xml:space="preserve">بازار (x1)</w:t>
+            </w:r>
+          </w:p>
+        </w:tc>
+        <w:tc>
+          <w:tcPr/>
+          <w:p>
+            <w:pPr>
+              <w:pStyle w:val="Compact"/>
+              <w:bidi/>
+            </w:pPr>
+            <w:r>
+              <w:rPr>
+                <w:rFonts w:ascii="Tahoma" w:hAnsi="Tahoma" w:cs="Tahoma"/>
+                <w:b/>
+                <w:bCs/>
+                <w:sz w:val="21"/>
+                <w:szCs w:val="21"/>
+                <w:rtl/>
+              </w:rPr>
+              <w:t xml:space="preserve">Market</w:t>
+            </w:r>
+          </w:p>
+        </w:tc>
+      </w:tr>
+      <w:tr>
+        <w:tc>
+          <w:tcPr/>
+          <w:p>
+            <w:pPr>
+              <w:pStyle w:val="Compact"/>
+              <w:bidi/>
+            </w:pPr>
+            <w:r>
+              <w:rPr>
+                <w:rFonts w:ascii="Tahoma" w:hAnsi="Tahoma" w:cs="Tahoma"/>
+                <w:sz w:val="21"/>
+                <w:szCs w:val="21"/>
+                <w:rtl/>
+              </w:rPr>
+              <w:t xml:space="preserve">نماد (x2)</w:t>
+            </w:r>
+          </w:p>
+        </w:tc>
+        <w:tc>
+          <w:tcPr/>
+          <w:p>
+            <w:pPr>
+              <w:pStyle w:val="Compact"/>
+              <w:bidi/>
+            </w:pPr>
+            <w:r>
+              <w:rPr>
+                <w:rFonts w:ascii="Tahoma" w:hAnsi="Tahoma" w:cs="Tahoma"/>
+                <w:b/>
+                <w:bCs/>
+                <w:sz w:val="21"/>
+                <w:szCs w:val="21"/>
+                <w:rtl/>
+              </w:rPr>
+              <w:t xml:space="preserve">Symbol</w:t>
             </w:r>
           </w:p>
         </w:tc>
@@ -1847,10 +1857,24 @@
     </w:tbl>
     <w:p>
       <w:pPr>
+        <w:bidi/>
+      </w:pPr>
+      <w:r>
+        <w:rPr>
+          <w:rFonts w:ascii="Tahoma" w:hAnsi="Tahoma" w:cs="Tahoma"/>
+          <w:sz w:val="21"/>
+          <w:szCs w:val="21"/>
+          <w:rtl/>
+        </w:rPr>
+        <w:t xml:space="preserve">دو ستون با نام یکسان industry نباید در فایل بماند. ستون‌های مالی با نام‌های بخش ۴ می‌آیند.</w:t>
+      </w:r>
+    </w:p>
+    <w:p>
+      <w:pPr>
         <w:pStyle w:val="Compact"/>
         <w:numPr>
           <w:ilvl w:val="0"/>
-          <w:numId w:val="1004"/>
+          <w:numId w:val="1005"/>
         </w:numPr>
         <w:bidi/>
       </w:pPr>
@@ -1863,7 +1887,7 @@
           <w:szCs w:val="21"/>
           <w:rtl/>
         </w:rPr>
-        <w:t xml:space="preserve">یک ردیف برای هر شرکت در هر سال</w:t>
+        <w:t xml:space="preserve">واحد پول یکسان در همه‌ی سال‌ها:</w:t>
       </w:r>
       <w:r>
         <w:rPr>
@@ -1881,7 +1905,7 @@
           <w:szCs w:val="21"/>
           <w:rtl/>
         </w:rPr>
-        <w:t xml:space="preserve">(فرمت بلند). ستون‌ها دقیقاً با نام‌های جدول بخش ۴، در یک برگه.</w:t>
+        <w:t xml:space="preserve">میلیون ریال.</w:t>
       </w:r>
     </w:p>
     <w:p>
@@ -1889,7 +1913,7 @@
         <w:pStyle w:val="Compact"/>
         <w:numPr>
           <w:ilvl w:val="0"/>
-          <w:numId w:val="1004"/>
+          <w:numId w:val="1005"/>
         </w:numPr>
         <w:bidi/>
       </w:pPr>
@@ -1902,7 +1926,7 @@
           <w:szCs w:val="21"/>
           <w:rtl/>
         </w:rPr>
-        <w:t xml:space="preserve">واحد پول یکسان در همه‌ی سال‌ها:</w:t>
+        <w:t xml:space="preserve">داده‌ی ناموجود = خانه‌ی خالی، نه صفر.</w:t>
       </w:r>
       <w:r>
         <w:rPr>
@@ -1920,7 +1944,7 @@
           <w:szCs w:val="21"/>
           <w:rtl/>
         </w:rPr>
-        <w:t xml:space="preserve">میلیون ریال. بعضی پایگاه‌ها در سال‌های قدیمی واحد را عوض می‌کنند. این را حتماً کنترل کنید.</w:t>
+        <w:t xml:space="preserve">صفر فقط وقتی که مقدار واقعاً صفر است.</w:t>
       </w:r>
     </w:p>
     <w:p>
@@ -1928,7 +1952,7 @@
         <w:pStyle w:val="Compact"/>
         <w:numPr>
           <w:ilvl w:val="0"/>
-          <w:numId w:val="1004"/>
+          <w:numId w:val="1005"/>
         </w:numPr>
         <w:bidi/>
       </w:pPr>
@@ -1941,25 +1965,16 @@
           <w:szCs w:val="21"/>
           <w:rtl/>
         </w:rPr>
-        <w:t xml:space="preserve">داده‌ی ناموجود = خانه‌ی خالی، نه صفر.</w:t>
-      </w:r>
-      <w:r>
-        <w:rPr>
-          <w:rFonts w:ascii="Tahoma" w:hAnsi="Tahoma" w:cs="Tahoma"/>
-          <w:sz w:val="21"/>
-          <w:szCs w:val="21"/>
-          <w:rtl/>
-        </w:rPr>
-        <w:t xml:space="preserve"> </w:t>
-      </w:r>
-      <w:r>
-        <w:rPr>
-          <w:rFonts w:ascii="Tahoma" w:hAnsi="Tahoma" w:cs="Tahoma"/>
-          <w:sz w:val="21"/>
-          <w:szCs w:val="21"/>
-          <w:rtl/>
-        </w:rPr>
-        <w:t xml:space="preserve">صفر فقط وقتی که مقدار واقعاً صفر است، مثلاً شرکتی که دارایی نامشهود یا هزینه‌ی مالی ندارد.</w:t>
+        <w:t xml:space="preserve">صورت‌های مالی جداگانه‌ی شرکت اصلی</w:t>
+      </w:r>
+      <w:r>
+        <w:rPr>
+          <w:rFonts w:ascii="Tahoma" w:hAnsi="Tahoma" w:cs="Tahoma"/>
+          <w:sz w:val="21"/>
+          <w:szCs w:val="21"/>
+          <w:rtl/>
+        </w:rPr>
+        <w:t xml:space="preserve">، نه تلفیقی، در همه‌ی سال‌ها.</w:t>
       </w:r>
     </w:p>
     <w:p>
@@ -1967,7 +1982,7 @@
         <w:pStyle w:val="Compact"/>
         <w:numPr>
           <w:ilvl w:val="0"/>
-          <w:numId w:val="1004"/>
+          <w:numId w:val="1005"/>
         </w:numPr>
         <w:bidi/>
       </w:pPr>
@@ -1980,16 +1995,16 @@
           <w:szCs w:val="21"/>
           <w:rtl/>
         </w:rPr>
-        <w:t xml:space="preserve">صورت‌های مالی جداگانه‌ی شرکت اصلی</w:t>
-      </w:r>
-      <w:r>
-        <w:rPr>
-          <w:rFonts w:ascii="Tahoma" w:hAnsi="Tahoma" w:cs="Tahoma"/>
-          <w:sz w:val="21"/>
-          <w:szCs w:val="21"/>
-          <w:rtl/>
-        </w:rPr>
-        <w:t xml:space="preserve">، نه تلفیقی. در همه‌ی سال‌ها یکسان.</w:t>
+        <w:t xml:space="preserve">ارقام حسابرسی‌شده‌ی گزارش همان سال</w:t>
+      </w:r>
+      <w:r>
+        <w:rPr>
+          <w:rFonts w:ascii="Tahoma" w:hAnsi="Tahoma" w:cs="Tahoma"/>
+          <w:sz w:val="21"/>
+          <w:szCs w:val="21"/>
+          <w:rtl/>
+        </w:rPr>
+        <w:t xml:space="preserve">؛ اگر تجدیدارائه‌شده استفاده می‌کنید، در همه‌ی سال‌ها.</w:t>
       </w:r>
     </w:p>
     <w:p>
@@ -1997,7 +2012,7 @@
         <w:pStyle w:val="Compact"/>
         <w:numPr>
           <w:ilvl w:val="0"/>
-          <w:numId w:val="1004"/>
+          <w:numId w:val="1005"/>
         </w:numPr>
         <w:bidi/>
       </w:pPr>
@@ -2010,7 +2025,7 @@
           <w:szCs w:val="21"/>
           <w:rtl/>
         </w:rPr>
-        <w:t xml:space="preserve">ارقام حسابرسی‌شده‌ی گزارش همان سال.</w:t>
+        <w:t xml:space="preserve">علامت جریان‌های نقدی:</w:t>
       </w:r>
       <w:r>
         <w:rPr>
@@ -2028,50 +2043,11 @@
           <w:szCs w:val="21"/>
           <w:rtl/>
         </w:rPr>
-        <w:t xml:space="preserve">اگر از ارقام تجدیدارائه‌شده استفاده می‌کنید، در همه‌ی سال‌ها همین کار را بکنید. ترکیب این دو مجاز نیست.</w:t>
-      </w:r>
-    </w:p>
-    <w:p>
-      <w:pPr>
-        <w:pStyle w:val="Compact"/>
-        <w:numPr>
-          <w:ilvl w:val="0"/>
-          <w:numId w:val="1004"/>
-        </w:numPr>
-        <w:bidi/>
-      </w:pPr>
-      <w:r>
-        <w:rPr>
-          <w:rFonts w:ascii="Tahoma" w:hAnsi="Tahoma" w:cs="Tahoma"/>
-          <w:b/>
-          <w:bCs/>
-          <w:sz w:val="21"/>
-          <w:szCs w:val="21"/>
-          <w:rtl/>
-        </w:rPr>
-        <w:t xml:space="preserve">علامت جریان‌های نقدی:</w:t>
-      </w:r>
-      <w:r>
-        <w:rPr>
-          <w:rFonts w:ascii="Tahoma" w:hAnsi="Tahoma" w:cs="Tahoma"/>
-          <w:sz w:val="21"/>
-          <w:szCs w:val="21"/>
-          <w:rtl/>
-        </w:rPr>
-        <w:t xml:space="preserve"> </w:t>
-      </w:r>
-      <w:r>
-        <w:rPr>
-          <w:rFonts w:ascii="Tahoma" w:hAnsi="Tahoma" w:cs="Tahoma"/>
-          <w:sz w:val="21"/>
-          <w:szCs w:val="21"/>
-          <w:rtl/>
-        </w:rPr>
-        <w:t xml:space="preserve">ورودی مثبت و خروجی منفی. مثلاً CFI معمولاً منفی است. این علامت برای تعریف چرخه‌ی عمر حیاتی است.</w:t>
+        <w:t xml:space="preserve">ورودی مثبت، خروجی منفی.</w:t>
       </w:r>
     </w:p>
     <w:bookmarkEnd w:id="11"/>
-    <w:bookmarkStart w:id="18" w:name="فهرست-متغیرها-۲۲-ستون"/>
+    <w:bookmarkStart w:id="18" w:name="فهرست-متغیرها"/>
     <w:p>
       <w:pPr>
         <w:pStyle w:val="Heading1"/>
@@ -2084,7 +2060,7 @@
           <w:szCs w:val="21"/>
           <w:rtl/>
         </w:rPr>
-        <w:t xml:space="preserve">۴. فهرست متغیرها (۲۲ ستون)</w:t>
+        <w:t xml:space="preserve">۴. فهرست متغیرها</w:t>
       </w:r>
     </w:p>
     <w:bookmarkStart w:id="12" w:name="شناسهها"/>
@@ -4556,7 +4532,7 @@
     </w:tbl>
     <w:bookmarkEnd w:id="17"/>
     <w:bookmarkEnd w:id="18"/>
-    <w:bookmarkStart w:id="19" w:name="چکلیست-پیش-از-ارسال"/>
+    <w:bookmarkStart w:id="19" w:name="چکلیست-پیش-از-اجرا"/>
     <w:p>
       <w:pPr>
         <w:pStyle w:val="Heading1"/>
@@ -4569,7 +4545,7 @@
           <w:szCs w:val="21"/>
           <w:rtl/>
         </w:rPr>
-        <w:t xml:space="preserve">۵. چک‌لیست پیش از ارسال</w:t>
+        <w:t xml:space="preserve">۵. چک‌لیست پیش از اجرا</w:t>
       </w:r>
     </w:p>
     <w:p>
@@ -4577,7 +4553,7 @@
         <w:pStyle w:val="Compact"/>
         <w:numPr>
           <w:ilvl w:val="0"/>
-          <w:numId w:val="1005"/>
+          <w:numId w:val="1006"/>
         </w:numPr>
         <w:bidi/>
       </w:pPr>
@@ -4588,7 +4564,7 @@
           <w:szCs w:val="21"/>
           <w:rtl/>
         </w:rPr>
-        <w:t xml:space="preserve">همه‌ی ۲۲ ستون با همین نام‌ها، در یک برگه.</w:t>
+        <w:t xml:space="preserve">نام ستون‌ها دقیقاً مطابق بخش ۳ و ۴.</w:t>
       </w:r>
     </w:p>
     <w:p>
@@ -4596,7 +4572,7 @@
         <w:pStyle w:val="Compact"/>
         <w:numPr>
           <w:ilvl w:val="0"/>
-          <w:numId w:val="1005"/>
+          <w:numId w:val="1006"/>
         </w:numPr>
         <w:bidi/>
       </w:pPr>
@@ -4607,7 +4583,7 @@
           <w:szCs w:val="21"/>
           <w:rtl/>
         </w:rPr>
-        <w:t xml:space="preserve">FirmCode و IndID برای هر شرکت در همه‌ی سال‌ها ثابت باشد.</w:t>
+        <w:t xml:space="preserve">همه‌ی شرکت‌ها و هر دو بازار در فایل باشند؛ چیزی را دستی حذف نکنید.</w:t>
       </w:r>
     </w:p>
     <w:p>
@@ -4615,7 +4591,7 @@
         <w:pStyle w:val="Compact"/>
         <w:numPr>
           <w:ilvl w:val="0"/>
-          <w:numId w:val="1005"/>
+          <w:numId w:val="1006"/>
         </w:numPr>
         <w:bidi/>
       </w:pPr>
@@ -4626,7 +4602,7 @@
           <w:szCs w:val="21"/>
           <w:rtl/>
         </w:rPr>
-        <w:t xml:space="preserve">واحد همه‌ی ارقام میلیون ریال باشد. ارقام را برای چند شرکت در سال‌های ۱۳۸۰، ۱۳۹۰ و ۱۴۰۰ با Codal مقایسه کنید.</w:t>
+        <w:t xml:space="preserve">واحد همه‌ی ارقام میلیون ریال باشد.</w:t>
       </w:r>
     </w:p>
     <w:p>
@@ -4634,7 +4610,7 @@
         <w:pStyle w:val="Compact"/>
         <w:numPr>
           <w:ilvl w:val="0"/>
-          <w:numId w:val="1005"/>
+          <w:numId w:val="1006"/>
         </w:numPr>
         <w:bidi/>
       </w:pPr>
@@ -4653,7 +4629,7 @@
         <w:pStyle w:val="Compact"/>
         <w:numPr>
           <w:ilvl w:val="0"/>
-          <w:numId w:val="1005"/>
+          <w:numId w:val="1006"/>
         </w:numPr>
         <w:bidi/>
       </w:pPr>
@@ -4664,95 +4640,39 @@
           <w:szCs w:val="21"/>
           <w:rtl/>
         </w:rPr>
-        <w:t xml:space="preserve">هیچ ردیف تکراری (یک شرکت، یک سال) نباشد.</w:t>
+        <w:t xml:space="preserve">خانه‌های ناموجود خالی باشند، نه صفر.</w:t>
+      </w:r>
+    </w:p>
+    <w:bookmarkEnd w:id="19"/>
+    <w:bookmarkStart w:id="20" w:name="اجرا"/>
+    <w:p>
+      <w:pPr>
+        <w:pStyle w:val="Heading1"/>
+        <w:bidi/>
+      </w:pPr>
+      <w:r>
+        <w:rPr>
+          <w:rFonts w:ascii="Tahoma" w:hAnsi="Tahoma" w:cs="Tahoma"/>
+          <w:sz w:val="21"/>
+          <w:szCs w:val="21"/>
+          <w:rtl/>
+        </w:rPr>
+        <w:t xml:space="preserve">۶. اجرا</w:t>
       </w:r>
     </w:p>
     <w:p>
       <w:pPr>
-        <w:pStyle w:val="Compact"/>
-        <w:numPr>
-          <w:ilvl w:val="0"/>
-          <w:numId w:val="1005"/>
-        </w:numPr>
         <w:bidi/>
       </w:pPr>
       <w:r>
         <w:rPr>
-          <w:rFonts w:ascii="Tahoma" w:hAnsi="Tahoma" w:cs="Tahoma"/>
-          <w:sz w:val="21"/>
-          <w:szCs w:val="21"/>
-          <w:rtl/>
-        </w:rPr>
-        <w:t xml:space="preserve">خانه‌های ناموجود خالی باشند، نه صفر.</w:t>
-      </w:r>
-    </w:p>
-    <w:p>
-      <w:pPr>
-        <w:pStyle w:val="Compact"/>
-        <w:numPr>
-          <w:ilvl w:val="0"/>
-          <w:numId w:val="1005"/>
-        </w:numPr>
-        <w:bidi/>
-      </w:pPr>
-      <w:r>
-        <w:rPr>
-          <w:rFonts w:ascii="Tahoma" w:hAnsi="Tahoma" w:cs="Tahoma"/>
-          <w:sz w:val="21"/>
-          <w:szCs w:val="21"/>
-          <w:rtl/>
-        </w:rPr>
-        <w:t xml:space="preserve">تعداد شرکت و سال-شرکت حذف‌شده در سه مرحله‌ی غربالگری دستی را یادداشت کنید.</w:t>
-      </w:r>
-    </w:p>
-    <w:p>
-      <w:pPr>
-        <w:pStyle w:val="Compact"/>
-        <w:numPr>
-          <w:ilvl w:val="0"/>
-          <w:numId w:val="1005"/>
-        </w:numPr>
-        <w:bidi/>
-      </w:pPr>
-      <w:r>
-        <w:rPr>
-          <w:rFonts w:ascii="Tahoma" w:hAnsi="Tahoma" w:cs="Tahoma"/>
-          <w:sz w:val="21"/>
-          <w:szCs w:val="21"/>
-          <w:rtl/>
-        </w:rPr>
-        <w:t xml:space="preserve">فهرست شرکت‌های خارج‌شده از بورس و سال خروجشان را، اگر دارید، در برگه‌ی جداگانه بفرستید.</w:t>
-      </w:r>
-    </w:p>
-    <w:bookmarkEnd w:id="19"/>
-    <w:bookmarkStart w:id="20" w:name="بعد-از-جمعآوری"/>
-    <w:p>
-      <w:pPr>
-        <w:pStyle w:val="Heading1"/>
-        <w:bidi/>
-      </w:pPr>
-      <w:r>
-        <w:rPr>
-          <w:rFonts w:ascii="Tahoma" w:hAnsi="Tahoma" w:cs="Tahoma"/>
-          <w:sz w:val="21"/>
-          <w:szCs w:val="21"/>
-          <w:rtl/>
-        </w:rPr>
-        <w:t xml:space="preserve">۶. بعد از جمع‌آوری</w:t>
-      </w:r>
-    </w:p>
-    <w:p>
-      <w:pPr>
-        <w:bidi/>
-      </w:pPr>
-      <w:r>
-        <w:rPr>
-          <w:rFonts w:ascii="Tahoma" w:hAnsi="Tahoma" w:cs="Tahoma"/>
-          <w:sz w:val="21"/>
-          <w:szCs w:val="21"/>
-          <w:rtl/>
-        </w:rPr>
-        <w:t xml:space="preserve">فایل را با نام</w:t>
+          <w:rStyle w:val="VerbatimChar"/>
+          <w:rFonts w:ascii="Tahoma" w:hAnsi="Tahoma" w:cs="Tahoma"/>
+          <w:sz w:val="21"/>
+          <w:szCs w:val="21"/>
+          <w:rtl/>
+        </w:rPr>
+        <w:t xml:space="preserve">Raw_All_Data.xlsx</w:t>
       </w:r>
       <w:r>
         <w:rPr>
@@ -4765,13 +4685,31 @@
       </w:r>
       <w:r>
         <w:rPr>
+          <w:rFonts w:ascii="Tahoma" w:hAnsi="Tahoma" w:cs="Tahoma"/>
+          <w:sz w:val="21"/>
+          <w:szCs w:val="21"/>
+          <w:rtl/>
+        </w:rPr>
+        <w:t xml:space="preserve">را در</w:t>
+      </w:r>
+      <w:r>
+        <w:rPr>
+          <w:rFonts w:ascii="Tahoma" w:hAnsi="Tahoma" w:cs="Tahoma"/>
+          <w:sz w:val="21"/>
+          <w:szCs w:val="21"/>
+          <w:rtl/>
+        </w:rPr>
+        <w:t xml:space="preserve"> </w:t>
+      </w:r>
+      <w:r>
+        <w:rPr>
           <w:rStyle w:val="VerbatimChar"/>
           <w:rFonts w:ascii="Tahoma" w:hAnsi="Tahoma" w:cs="Tahoma"/>
           <w:sz w:val="21"/>
           <w:szCs w:val="21"/>
           <w:rtl/>
         </w:rPr>
-        <w:t xml:space="preserve">Final_Master_Data.xlsx</w:t>
+        <w:t xml:space="preserve">C:/Users/Rohi/Desktop/Data</w:t>
       </w:r>
       <w:r>
         <w:rPr>
@@ -4789,7 +4727,7 @@
           <w:szCs w:val="21"/>
           <w:rtl/>
         </w:rPr>
-        <w:t xml:space="preserve">در پوشه‌ی</w:t>
+        <w:t xml:space="preserve">بگذارید و</w:t>
       </w:r>
       <w:r>
         <w:rPr>
@@ -4808,7 +4746,7 @@
           <w:szCs w:val="21"/>
           <w:rtl/>
         </w:rPr>
-        <w:t xml:space="preserve">C:/Users/Rohi/Desktop/Data</w:t>
+        <w:t xml:space="preserve">00_run_all.do</w:t>
       </w:r>
       <w:r>
         <w:rPr>
@@ -4826,44 +4764,7 @@
           <w:szCs w:val="21"/>
           <w:rtl/>
         </w:rPr>
-        <w:t xml:space="preserve">بگذارید و</w:t>
-      </w:r>
-      <w:r>
-        <w:rPr>
-          <w:rFonts w:ascii="Tahoma" w:hAnsi="Tahoma" w:cs="Tahoma"/>
-          <w:sz w:val="21"/>
-          <w:szCs w:val="21"/>
-          <w:rtl/>
-        </w:rPr>
-        <w:t xml:space="preserve"> </w:t>
-      </w:r>
-      <w:r>
-        <w:rPr>
-          <w:rStyle w:val="VerbatimChar"/>
-          <w:rFonts w:ascii="Tahoma" w:hAnsi="Tahoma" w:cs="Tahoma"/>
-          <w:sz w:val="21"/>
-          <w:szCs w:val="21"/>
-          <w:rtl/>
-        </w:rPr>
-        <w:t xml:space="preserve">00_run_all.do</w:t>
-      </w:r>
-      <w:r>
-        <w:rPr>
-          <w:rFonts w:ascii="Tahoma" w:hAnsi="Tahoma" w:cs="Tahoma"/>
-          <w:sz w:val="21"/>
-          <w:szCs w:val="21"/>
-          <w:rtl/>
-        </w:rPr>
-        <w:t xml:space="preserve"> </w:t>
-      </w:r>
-      <w:r>
-        <w:rPr>
-          <w:rFonts w:ascii="Tahoma" w:hAnsi="Tahoma" w:cs="Tahoma"/>
-          <w:sz w:val="21"/>
-          <w:szCs w:val="21"/>
-          <w:rtl/>
-        </w:rPr>
-        <w:t xml:space="preserve">را اجرا کنید. کد سال اول (۱۳۸۰) را خودکار سال پایه می‌گیرد. برآورد مدل‌ها از ۱۳۸۳ شروع می‌شود، چون سه سال برای وقفه‌ها لازم است. دوره‌ی قبلی هم در آزمون حساسیت S10 گزارش می‌شود.</w:t>
+        <w:t xml:space="preserve">را اجرا کنید. کد اول غربالگری می‌کند، بعد همه‌ی مدل‌ها را برآورد می‌کند. سال اول داده (۱۳۸۰) سال پایه است و برآورد مدل‌ها از ۱۳۸۳ شروع می‌شود. دوره‌ی قبلی در آزمون حساسیت S10 گزارش می‌شود.</w:t>
       </w:r>
     </w:p>
     <w:p>
@@ -5242,6 +5143,9 @@
     <w:abstractNumId w:val="991"/>
   </w:num>
   <w:num w:numId="1005">
+    <w:abstractNumId w:val="991"/>
+  </w:num>
+  <w:num w:numId="1006">
     <w:abstractNumId w:val="99411"/>
     <w:lvlOverride w:ilvl="0">
       <w:startOverride w:val="1"/>

</xml_diff>